<commit_message>
TranPhat: update bao cao
</commit_message>
<xml_diff>
--- a/docs/report.docx
+++ b/docs/report.docx
@@ -1114,6 +1114,8 @@
         <w:spacing w:before="0" w:after="100" w:line="276" w:lineRule="auto"/>
         <w:jc w:val="both"/>
         <w:rPr>
+          <w:b w:val="0"/>
+          <w:bCs w:val="0"/>
           <w:color w:val="auto"/>
         </w:rPr>
       </w:pPr>
@@ -1138,55 +1140,16 @@
           <w:rFonts w:ascii="Times New Roman" w:hAnsi="Times New Roman" w:eastAsia="Times New Roman" w:cs="Times New Roman"/>
           <w:color w:val="auto"/>
         </w:rPr>
-        <w:t xml:space="preserve"> của Trường. Văn bản này dài (19 điều và một bảng phụ lục chấm điểm hơn 100 dòng), nhiều mục cộng/trừ điểm nằm rải rác, nên sinh viên thường không biết một hoạt động được bao nhiêu điểm, tự tính sai tổng điểm, và khi thấy điểm bị thiếu thì không rõ thủ tục khiếu nại. Nhóm xây dựng một </w:t>
-      </w:r>
-      <w:r>
-        <w:rPr>
-          <w:rFonts w:ascii="Times New Roman" w:hAnsi="Times New Roman" w:eastAsia="Times New Roman" w:cs="Times New Roman"/>
-          <w:b/>
-          <w:bCs/>
-          <w:color w:val="auto"/>
-        </w:rPr>
-        <w:t>agent</w:t>
-      </w:r>
-      <w:r>
-        <w:rPr>
-          <w:rFonts w:ascii="Times New Roman" w:hAnsi="Times New Roman" w:eastAsia="Times New Roman" w:cs="Times New Roman"/>
-          <w:color w:val="auto"/>
-        </w:rPr>
-        <w:t xml:space="preserve"> trả lời câu hỏi về quy định (có trích dẫn nguồn), </w:t>
-      </w:r>
-      <w:r>
-        <w:rPr>
-          <w:rFonts w:ascii="Times New Roman" w:hAnsi="Times New Roman" w:eastAsia="Times New Roman" w:cs="Times New Roman"/>
-          <w:b/>
-          <w:bCs/>
-          <w:color w:val="auto"/>
-        </w:rPr>
-        <w:t>tính điểm bằng tool</w:t>
-      </w:r>
-      <w:r>
-        <w:rPr>
-          <w:rFonts w:ascii="Times New Roman" w:hAnsi="Times New Roman" w:eastAsia="Times New Roman" w:cs="Times New Roman"/>
-          <w:color w:val="auto"/>
-        </w:rPr>
-        <w:t xml:space="preserve"> thay vì để LLM tự nhẩm, và </w:t>
-      </w:r>
-      <w:r>
-        <w:rPr>
-          <w:rFonts w:ascii="Times New Roman" w:hAnsi="Times New Roman" w:eastAsia="Times New Roman" w:cs="Times New Roman"/>
-          <w:b/>
-          <w:bCs/>
-          <w:color w:val="auto"/>
-        </w:rPr>
-        <w:t>tạo đơn khiếu nại rồi tự kiểm tra lại</w:t>
-      </w:r>
-      <w:r>
-        <w:rPr>
-          <w:rFonts w:ascii="Times New Roman" w:hAnsi="Times New Roman" w:eastAsia="Times New Roman" w:cs="Times New Roman"/>
-          <w:color w:val="auto"/>
-        </w:rPr>
-        <w:t xml:space="preserve"> đơn đã được lưu.</w:t>
+        <w:t xml:space="preserve"> của Trường. Văn bản này dài (19 điều và một bảng phụ lục chấm điểm hơn 100 dòng), nhiều mục cộng/trừ điểm nằm rải rác, nên sinh viên thường không biết một hoạt động được bao nhiêu điểm, tự tính sai tổng điểm, và khi thấy điểm bị thiếu thì không rõ thủ tục khiếu nại. </w:t>
+      </w:r>
+      <w:r>
+        <w:rPr>
+          <w:rFonts w:ascii="Times New Roman" w:hAnsi="Times New Roman" w:eastAsia="Times New Roman" w:cs="Times New Roman"/>
+          <w:b w:val="0"/>
+          <w:bCs w:val="0"/>
+          <w:color w:val="auto"/>
+        </w:rPr>
+        <w:t>Nhóm xây dựng một agent trả lời câu hỏi về quy định (có trích dẫn nguồn), tính điểm bằng tool thay vì để LLM tự nhẩm, và tạo đơn khiếu nại rồi tự kiểm tra lại đơn đã được lưu.</w:t>
       </w:r>
     </w:p>
     <w:p>
@@ -1255,7 +1218,7 @@
     </w:p>
     <w:p>
       <w:pPr>
-        <w:pStyle w:val="18"/>
+        <w:pStyle w:val="19"/>
         <w:numPr>
           <w:ilvl w:val="0"/>
           <w:numId w:val="1"/>
@@ -1273,7 +1236,7 @@
           <w:bCs/>
           <w:color w:val="auto"/>
         </w:rPr>
-        <w:t xml:space="preserve">(a) Tra cứu:</w:t>
+        <w:t>(a) Tra cứu:</w:t>
       </w:r>
       <w:r>
         <w:rPr>
@@ -1289,19 +1252,19 @@
           <w:sz w:val="21"/>
           <w:szCs w:val="21"/>
         </w:rPr>
-        <w:t xml:space="preserve">(doc_id: DOC0008, Điều 11)</w:t>
-      </w:r>
-      <w:r>
-        <w:rPr>
-          <w:rFonts w:ascii="Times New Roman" w:hAnsi="Times New Roman" w:eastAsia="Times New Roman" w:cs="Times New Roman"/>
-          <w:color w:val="auto"/>
-        </w:rPr>
-        <w:t xml:space="preserve">; dữ liệu có 2 phiên bản của cùng một quy định, mặc định trả lời theo bản mới nhất và nói rõ đang dùng bản nào; nếu tài liệu không có thông tin thì trả lời câu từ chối cố định.</w:t>
-      </w:r>
-    </w:p>
-    <w:p>
-      <w:pPr>
-        <w:pStyle w:val="18"/>
+        <w:t>(doc_id: DOC0008, Điều 11)</w:t>
+      </w:r>
+      <w:r>
+        <w:rPr>
+          <w:rFonts w:ascii="Times New Roman" w:hAnsi="Times New Roman" w:eastAsia="Times New Roman" w:cs="Times New Roman"/>
+          <w:color w:val="auto"/>
+        </w:rPr>
+        <w:t>; dữ liệu có 2 phiên bản của cùng một quy định, mặc định trả lời theo bản mới nhất và nói rõ đang dùng bản nào; nếu tài liệu không có thông tin thì trả lời câu từ chối cố định.</w:t>
+      </w:r>
+    </w:p>
+    <w:p>
+      <w:pPr>
+        <w:pStyle w:val="19"/>
         <w:numPr>
           <w:ilvl w:val="0"/>
           <w:numId w:val="1"/>
@@ -1363,7 +1326,7 @@
     </w:p>
     <w:p>
       <w:pPr>
-        <w:pStyle w:val="18"/>
+        <w:pStyle w:val="19"/>
         <w:numPr>
           <w:ilvl w:val="0"/>
           <w:numId w:val="1"/>
@@ -1457,7 +1420,7 @@
     </w:p>
     <w:p>
       <w:pPr>
-        <w:pStyle w:val="18"/>
+        <w:pStyle w:val="19"/>
         <w:numPr>
           <w:ilvl w:val="0"/>
           <w:numId w:val="1"/>
@@ -1494,7 +1457,7 @@
     </w:p>
     <w:p>
       <w:pPr>
-        <w:pStyle w:val="18"/>
+        <w:pStyle w:val="19"/>
         <w:numPr>
           <w:ilvl w:val="0"/>
           <w:numId w:val="1"/>
@@ -1515,7 +1478,7 @@
     </w:p>
     <w:p>
       <w:pPr>
-        <w:pStyle w:val="18"/>
+        <w:pStyle w:val="19"/>
         <w:numPr>
           <w:ilvl w:val="0"/>
           <w:numId w:val="1"/>
@@ -1536,7 +1499,7 @@
     </w:p>
     <w:p>
       <w:pPr>
-        <w:pStyle w:val="18"/>
+        <w:pStyle w:val="19"/>
         <w:numPr>
           <w:ilvl w:val="0"/>
           <w:numId w:val="1"/>
@@ -1573,7 +1536,7 @@
     </w:p>
     <w:p>
       <w:pPr>
-        <w:pStyle w:val="18"/>
+        <w:pStyle w:val="19"/>
         <w:numPr>
           <w:ilvl w:val="0"/>
           <w:numId w:val="1"/>
@@ -1589,12 +1552,42 @@
           <w:rFonts w:ascii="Times New Roman" w:hAnsi="Times New Roman" w:eastAsia="Times New Roman" w:cs="Times New Roman"/>
           <w:color w:val="auto"/>
         </w:rPr>
-        <w:t>Dữ liệu gồm 2 phiên bản của cùng một quy định: bản năm 2021 (DOC0007, áp dụng từ năm học 2021–2022) và bản sửa đổi năm 2024 (DOC0008, áp dụng từ năm học 2024–2025). Bản 2024 là bản giả lập do giảng viên cung cấp để kiểm tra RAG có phân biệt được phiên bản hay không; hệ thống coi bản có năm áp dụng mới nhất là bản đang hiệu lực.</w:t>
-      </w:r>
-    </w:p>
-    <w:p>
-      <w:pPr>
-        <w:pStyle w:val="18"/>
+        <w:t xml:space="preserve">Dữ liệu gồm 2 phiên bản của cùng một quy định: bản năm 2021 (DOC0007, áp dụng từ năm học 2021–2022) và bản sửa đổi năm 2024 (DOC0008, áp dụng từ năm học 2024–2025). Bản 2024 là bản giả lập do </w:t>
+      </w:r>
+      <w:r>
+        <w:rPr>
+          <w:rFonts w:hint="default" w:cs="Times New Roman"/>
+          <w:color w:val="auto"/>
+          <w:lang w:val="en-US"/>
+        </w:rPr>
+        <w:t>sinh</w:t>
+      </w:r>
+      <w:r>
+        <w:rPr>
+          <w:rFonts w:ascii="Times New Roman" w:hAnsi="Times New Roman" w:eastAsia="Times New Roman" w:cs="Times New Roman"/>
+          <w:color w:val="auto"/>
+        </w:rPr>
+        <w:t xml:space="preserve"> viên </w:t>
+      </w:r>
+      <w:r>
+        <w:rPr>
+          <w:rFonts w:hint="default" w:cs="Times New Roman"/>
+          <w:color w:val="auto"/>
+          <w:lang w:val="en-US"/>
+        </w:rPr>
+        <w:t>lập dùng</w:t>
+      </w:r>
+      <w:r>
+        <w:rPr>
+          <w:rFonts w:ascii="Times New Roman" w:hAnsi="Times New Roman" w:eastAsia="Times New Roman" w:cs="Times New Roman"/>
+          <w:color w:val="auto"/>
+        </w:rPr>
+        <w:t xml:space="preserve"> để kiểm tra RAG có phân biệt được phiên bản hay không; hệ thống coi bản có năm áp dụng mới nhất là bản đang hiệu lực.</w:t>
+      </w:r>
+    </w:p>
+    <w:p>
+      <w:pPr>
+        <w:pStyle w:val="19"/>
         <w:numPr>
           <w:ilvl w:val="0"/>
           <w:numId w:val="1"/>
@@ -1615,7 +1608,7 @@
     </w:p>
     <w:p>
       <w:pPr>
-        <w:pStyle w:val="18"/>
+        <w:pStyle w:val="19"/>
         <w:numPr>
           <w:ilvl w:val="0"/>
           <w:numId w:val="1"/>
@@ -1935,12 +1928,31 @@
           <w:iCs/>
           <w:color w:val="auto"/>
         </w:rPr>
-        <w:t>“Em là sinh viên mã số 22110001. Điểm hoạt động tình nguyện học kỳ 1 của em chưa được cộng, em muốn tạo đơn khiếu nại.”</w:t>
-      </w:r>
-    </w:p>
-    <w:p>
-      <w:pPr>
-        <w:pStyle w:val="18"/>
+        <w:t>“Em là sinh viên mã số 2</w:t>
+      </w:r>
+      <w:r>
+        <w:rPr>
+          <w:rFonts w:hint="default" w:cs="Times New Roman"/>
+          <w:i/>
+          <w:iCs/>
+          <w:color w:val="auto"/>
+          <w:lang w:val="en-US"/>
+        </w:rPr>
+        <w:t>4110119</w:t>
+      </w:r>
+      <w:r>
+        <w:rPr>
+          <w:rFonts w:ascii="Times New Roman" w:hAnsi="Times New Roman" w:eastAsia="Times New Roman" w:cs="Times New Roman"/>
+          <w:i/>
+          <w:iCs/>
+          <w:color w:val="auto"/>
+        </w:rPr>
+        <w:t>. Điểm hoạt động tình nguyện học kỳ 1 của em chưa được cộng, em muốn tạo đơn khiếu nại.”</w:t>
+      </w:r>
+    </w:p>
+    <w:p>
+      <w:pPr>
+        <w:pStyle w:val="19"/>
         <w:numPr>
           <w:ilvl w:val="0"/>
           <w:numId w:val="2"/>
@@ -2018,7 +2030,7 @@
     </w:p>
     <w:p>
       <w:pPr>
-        <w:pStyle w:val="18"/>
+        <w:pStyle w:val="19"/>
         <w:numPr>
           <w:ilvl w:val="0"/>
           <w:numId w:val="2"/>
@@ -2071,7 +2083,7 @@
     </w:p>
     <w:p>
       <w:pPr>
-        <w:pStyle w:val="18"/>
+        <w:pStyle w:val="19"/>
         <w:numPr>
           <w:ilvl w:val="0"/>
           <w:numId w:val="2"/>
@@ -2140,7 +2152,7 @@
     </w:p>
     <w:p>
       <w:pPr>
-        <w:pStyle w:val="18"/>
+        <w:pStyle w:val="19"/>
         <w:numPr>
           <w:ilvl w:val="0"/>
           <w:numId w:val="2"/>
@@ -2209,7 +2221,7 @@
     </w:p>
     <w:p>
       <w:pPr>
-        <w:pStyle w:val="18"/>
+        <w:pStyle w:val="19"/>
         <w:numPr>
           <w:ilvl w:val="0"/>
           <w:numId w:val="2"/>
@@ -2246,7 +2258,7 @@
     </w:p>
     <w:p>
       <w:pPr>
-        <w:pStyle w:val="18"/>
+        <w:pStyle w:val="19"/>
         <w:numPr>
           <w:ilvl w:val="0"/>
           <w:numId w:val="2"/>
@@ -2317,7 +2329,9 @@
         <w:pStyle w:val="3"/>
         <w:spacing w:before="140" w:after="80"/>
         <w:rPr>
-          <w:color w:val="auto"/>
+          <w:rFonts w:ascii="Times New Roman" w:hAnsi="Times New Roman" w:eastAsia="Times New Roman" w:cs="Times New Roman"/>
+          <w:color w:val="auto"/>
+          <w:vertAlign w:val="baseline"/>
         </w:rPr>
       </w:pPr>
       <w:r>
@@ -2330,8 +2344,8 @@
     </w:p>
     <w:tbl>
       <w:tblPr>
-        <w:tblStyle w:val="9"/>
-        <w:tblW w:w="9638" w:type="dxa"/>
+        <w:tblStyle w:val="17"/>
+        <w:tblW w:w="0" w:type="auto"/>
         <w:tblInd w:w="0" w:type="dxa"/>
         <w:tblBorders>
           <w:top w:val="single" w:color="auto" w:sz="4" w:space="0"/>
@@ -2343,18 +2357,16 @@
         </w:tblBorders>
         <w:tblLayout w:type="autofit"/>
         <w:tblCellMar>
-          <w:top w:w="0" w:type="dxa"/>
-          <w:left w:w="10" w:type="dxa"/>
-          <w:bottom w:w="0" w:type="dxa"/>
-          <w:right w:w="10" w:type="dxa"/>
+          <w:left w:w="108" w:type="dxa"/>
+          <w:right w:w="108" w:type="dxa"/>
         </w:tblCellMar>
       </w:tblPr>
       <w:tblGrid>
-        <w:gridCol w:w="1100"/>
-        <w:gridCol w:w="3200"/>
-        <w:gridCol w:w="1100"/>
-        <w:gridCol w:w="2438"/>
-        <w:gridCol w:w="1800"/>
+        <w:gridCol w:w="1959"/>
+        <w:gridCol w:w="1954"/>
+        <w:gridCol w:w="1956"/>
+        <w:gridCol w:w="1958"/>
+        <w:gridCol w:w="2019"/>
       </w:tblGrid>
       <w:tr>
         <w:tblPrEx>
@@ -2366,39 +2378,53 @@
             <w:insideH w:val="single" w:color="auto" w:sz="4" w:space="0"/>
             <w:insideV w:val="single" w:color="auto" w:sz="4" w:space="0"/>
           </w:tblBorders>
-          <w:tblCellMar>
-            <w:top w:w="0" w:type="dxa"/>
-            <w:left w:w="10" w:type="dxa"/>
-            <w:bottom w:w="0" w:type="dxa"/>
-            <w:right w:w="10" w:type="dxa"/>
-          </w:tblCellMar>
         </w:tblPrEx>
-        <w:trPr>
-          <w:tblHeader/>
-        </w:trPr>
-        <w:tc>
-          <w:tcPr>
-            <w:tcW w:w="1100" w:type="dxa"/>
-            <w:tcBorders>
-              <w:top w:val="single" w:color="8C8C8C" w:sz="4" w:space="0"/>
-              <w:left w:val="single" w:color="8C8C8C" w:sz="4" w:space="0"/>
-              <w:bottom w:val="single" w:color="8C8C8C" w:sz="4" w:space="0"/>
-              <w:right w:val="single" w:color="8C8C8C" w:sz="4" w:space="0"/>
-            </w:tcBorders>
-            <w:shd w:val="clear" w:color="auto" w:fill="D9E2F3"/>
-            <w:tcMar>
-              <w:top w:w="50" w:type="dxa"/>
-              <w:left w:w="90" w:type="dxa"/>
-              <w:bottom w:w="50" w:type="dxa"/>
-              <w:right w:w="90" w:type="dxa"/>
-            </w:tcMar>
-          </w:tcPr>
-          <w:p>
-            <w:pPr>
-              <w:spacing w:after="0" w:line="252" w:lineRule="auto"/>
-              <w:jc w:val="left"/>
-              <w:rPr>
-                <w:color w:val="auto"/>
+        <w:tc>
+          <w:tcPr>
+            <w:tcW w:w="1959" w:type="dxa"/>
+          </w:tcPr>
+          <w:p>
+            <w:pPr>
+              <w:pStyle w:val="3"/>
+              <w:spacing w:before="140" w:after="80"/>
+              <w:jc w:val="center"/>
+              <w:rPr>
+                <w:rFonts w:hint="default" w:ascii="Times New Roman" w:hAnsi="Times New Roman" w:eastAsia="Times New Roman" w:cs="Times New Roman"/>
+                <w:color w:val="auto"/>
+                <w:sz w:val="22"/>
+                <w:szCs w:val="22"/>
+                <w:vertAlign w:val="baseline"/>
+                <w:lang w:val="en-US"/>
+              </w:rPr>
+            </w:pPr>
+            <w:r>
+              <w:rPr>
+                <w:rFonts w:hint="default" w:cs="Times New Roman"/>
+                <w:color w:val="auto"/>
+                <w:sz w:val="22"/>
+                <w:szCs w:val="22"/>
+                <w:vertAlign w:val="baseline"/>
+                <w:lang w:val="en-US"/>
+              </w:rPr>
+              <w:t>doc_id</w:t>
+            </w:r>
+          </w:p>
+        </w:tc>
+        <w:tc>
+          <w:tcPr>
+            <w:tcW w:w="1954" w:type="dxa"/>
+          </w:tcPr>
+          <w:p>
+            <w:pPr>
+              <w:pStyle w:val="3"/>
+              <w:spacing w:before="140" w:after="80"/>
+              <w:jc w:val="center"/>
+              <w:rPr>
+                <w:rFonts w:ascii="Times New Roman" w:hAnsi="Times New Roman" w:eastAsia="Times New Roman" w:cs="Times New Roman"/>
+                <w:color w:val="auto"/>
+                <w:sz w:val="22"/>
+                <w:szCs w:val="22"/>
+                <w:vertAlign w:val="baseline"/>
               </w:rPr>
             </w:pPr>
             <w:r>
@@ -2407,36 +2433,28 @@
                 <w:b/>
                 <w:bCs/>
                 <w:color w:val="auto"/>
-                <w:sz w:val="21"/>
-                <w:szCs w:val="21"/>
-              </w:rPr>
-              <w:t>doc_id</w:t>
-            </w:r>
-          </w:p>
-        </w:tc>
-        <w:tc>
-          <w:tcPr>
-            <w:tcW w:w="3200" w:type="dxa"/>
-            <w:tcBorders>
-              <w:top w:val="single" w:color="8C8C8C" w:sz="4" w:space="0"/>
-              <w:left w:val="single" w:color="8C8C8C" w:sz="4" w:space="0"/>
-              <w:bottom w:val="single" w:color="8C8C8C" w:sz="4" w:space="0"/>
-              <w:right w:val="single" w:color="8C8C8C" w:sz="4" w:space="0"/>
-            </w:tcBorders>
-            <w:shd w:val="clear" w:color="auto" w:fill="D9E2F3"/>
-            <w:tcMar>
-              <w:top w:w="50" w:type="dxa"/>
-              <w:left w:w="90" w:type="dxa"/>
-              <w:bottom w:w="50" w:type="dxa"/>
-              <w:right w:w="90" w:type="dxa"/>
-            </w:tcMar>
-          </w:tcPr>
-          <w:p>
-            <w:pPr>
-              <w:spacing w:after="0" w:line="252" w:lineRule="auto"/>
-              <w:jc w:val="left"/>
-              <w:rPr>
-                <w:color w:val="auto"/>
+                <w:sz w:val="22"/>
+                <w:szCs w:val="22"/>
+              </w:rPr>
+              <w:t>title</w:t>
+            </w:r>
+          </w:p>
+        </w:tc>
+        <w:tc>
+          <w:tcPr>
+            <w:tcW w:w="1956" w:type="dxa"/>
+          </w:tcPr>
+          <w:p>
+            <w:pPr>
+              <w:pStyle w:val="3"/>
+              <w:spacing w:before="140" w:after="80"/>
+              <w:jc w:val="center"/>
+              <w:rPr>
+                <w:rFonts w:ascii="Times New Roman" w:hAnsi="Times New Roman" w:eastAsia="Times New Roman" w:cs="Times New Roman"/>
+                <w:color w:val="auto"/>
+                <w:sz w:val="22"/>
+                <w:szCs w:val="22"/>
+                <w:vertAlign w:val="baseline"/>
               </w:rPr>
             </w:pPr>
             <w:r>
@@ -2445,36 +2463,28 @@
                 <w:b/>
                 <w:bCs/>
                 <w:color w:val="auto"/>
-                <w:sz w:val="21"/>
-                <w:szCs w:val="21"/>
-              </w:rPr>
-              <w:t>title</w:t>
-            </w:r>
-          </w:p>
-        </w:tc>
-        <w:tc>
-          <w:tcPr>
-            <w:tcW w:w="1100" w:type="dxa"/>
-            <w:tcBorders>
-              <w:top w:val="single" w:color="8C8C8C" w:sz="4" w:space="0"/>
-              <w:left w:val="single" w:color="8C8C8C" w:sz="4" w:space="0"/>
-              <w:bottom w:val="single" w:color="8C8C8C" w:sz="4" w:space="0"/>
-              <w:right w:val="single" w:color="8C8C8C" w:sz="4" w:space="0"/>
-            </w:tcBorders>
-            <w:shd w:val="clear" w:color="auto" w:fill="D9E2F3"/>
-            <w:tcMar>
-              <w:top w:w="50" w:type="dxa"/>
-              <w:left w:w="90" w:type="dxa"/>
-              <w:bottom w:w="50" w:type="dxa"/>
-              <w:right w:w="90" w:type="dxa"/>
-            </w:tcMar>
-          </w:tcPr>
-          <w:p>
-            <w:pPr>
-              <w:spacing w:after="0" w:line="252" w:lineRule="auto"/>
-              <w:jc w:val="left"/>
-              <w:rPr>
-                <w:color w:val="auto"/>
+                <w:sz w:val="22"/>
+                <w:szCs w:val="22"/>
+              </w:rPr>
+              <w:t>version</w:t>
+            </w:r>
+          </w:p>
+        </w:tc>
+        <w:tc>
+          <w:tcPr>
+            <w:tcW w:w="1958" w:type="dxa"/>
+          </w:tcPr>
+          <w:p>
+            <w:pPr>
+              <w:pStyle w:val="3"/>
+              <w:spacing w:before="140" w:after="80"/>
+              <w:jc w:val="center"/>
+              <w:rPr>
+                <w:rFonts w:ascii="Times New Roman" w:hAnsi="Times New Roman" w:eastAsia="Times New Roman" w:cs="Times New Roman"/>
+                <w:color w:val="auto"/>
+                <w:sz w:val="22"/>
+                <w:szCs w:val="22"/>
+                <w:vertAlign w:val="baseline"/>
               </w:rPr>
             </w:pPr>
             <w:r>
@@ -2483,36 +2493,28 @@
                 <w:b/>
                 <w:bCs/>
                 <w:color w:val="auto"/>
-                <w:sz w:val="21"/>
-                <w:szCs w:val="21"/>
-              </w:rPr>
-              <w:t>version</w:t>
-            </w:r>
-          </w:p>
-        </w:tc>
-        <w:tc>
-          <w:tcPr>
-            <w:tcW w:w="2438" w:type="dxa"/>
-            <w:tcBorders>
-              <w:top w:val="single" w:color="8C8C8C" w:sz="4" w:space="0"/>
-              <w:left w:val="single" w:color="8C8C8C" w:sz="4" w:space="0"/>
-              <w:bottom w:val="single" w:color="8C8C8C" w:sz="4" w:space="0"/>
-              <w:right w:val="single" w:color="8C8C8C" w:sz="4" w:space="0"/>
-            </w:tcBorders>
-            <w:shd w:val="clear" w:color="auto" w:fill="D9E2F3"/>
-            <w:tcMar>
-              <w:top w:w="50" w:type="dxa"/>
-              <w:left w:w="90" w:type="dxa"/>
-              <w:bottom w:w="50" w:type="dxa"/>
-              <w:right w:w="90" w:type="dxa"/>
-            </w:tcMar>
-          </w:tcPr>
-          <w:p>
-            <w:pPr>
-              <w:spacing w:after="0" w:line="252" w:lineRule="auto"/>
-              <w:jc w:val="left"/>
-              <w:rPr>
-                <w:color w:val="auto"/>
+                <w:sz w:val="22"/>
+                <w:szCs w:val="22"/>
+              </w:rPr>
+              <w:t>owner</w:t>
+            </w:r>
+          </w:p>
+        </w:tc>
+        <w:tc>
+          <w:tcPr>
+            <w:tcW w:w="2019" w:type="dxa"/>
+          </w:tcPr>
+          <w:p>
+            <w:pPr>
+              <w:pStyle w:val="3"/>
+              <w:spacing w:before="140" w:after="80"/>
+              <w:jc w:val="center"/>
+              <w:rPr>
+                <w:rFonts w:ascii="Times New Roman" w:hAnsi="Times New Roman" w:eastAsia="Times New Roman" w:cs="Times New Roman"/>
+                <w:color w:val="auto"/>
+                <w:sz w:val="22"/>
+                <w:szCs w:val="22"/>
+                <w:vertAlign w:val="baseline"/>
               </w:rPr>
             </w:pPr>
             <w:r>
@@ -2521,46 +2523,8 @@
                 <w:b/>
                 <w:bCs/>
                 <w:color w:val="auto"/>
-                <w:sz w:val="21"/>
-                <w:szCs w:val="21"/>
-              </w:rPr>
-              <w:t>owner</w:t>
-            </w:r>
-          </w:p>
-        </w:tc>
-        <w:tc>
-          <w:tcPr>
-            <w:tcW w:w="1800" w:type="dxa"/>
-            <w:tcBorders>
-              <w:top w:val="single" w:color="8C8C8C" w:sz="4" w:space="0"/>
-              <w:left w:val="single" w:color="8C8C8C" w:sz="4" w:space="0"/>
-              <w:bottom w:val="single" w:color="8C8C8C" w:sz="4" w:space="0"/>
-              <w:right w:val="single" w:color="8C8C8C" w:sz="4" w:space="0"/>
-            </w:tcBorders>
-            <w:shd w:val="clear" w:color="auto" w:fill="D9E2F3"/>
-            <w:tcMar>
-              <w:top w:w="50" w:type="dxa"/>
-              <w:left w:w="90" w:type="dxa"/>
-              <w:bottom w:w="50" w:type="dxa"/>
-              <w:right w:w="90" w:type="dxa"/>
-            </w:tcMar>
-          </w:tcPr>
-          <w:p>
-            <w:pPr>
-              <w:spacing w:after="0" w:line="252" w:lineRule="auto"/>
-              <w:jc w:val="left"/>
-              <w:rPr>
-                <w:color w:val="auto"/>
-              </w:rPr>
-            </w:pPr>
-            <w:r>
-              <w:rPr>
-                <w:rFonts w:ascii="Times New Roman" w:hAnsi="Times New Roman" w:eastAsia="Times New Roman" w:cs="Times New Roman"/>
-                <w:b/>
-                <w:bCs/>
-                <w:color w:val="auto"/>
-                <w:sz w:val="21"/>
-                <w:szCs w:val="21"/>
+                <w:sz w:val="22"/>
+                <w:szCs w:val="22"/>
               </w:rPr>
               <w:t>File</w:t>
             </w:r>
@@ -2578,39 +2542,31 @@
             <w:insideV w:val="single" w:color="auto" w:sz="4" w:space="0"/>
           </w:tblBorders>
           <w:tblCellMar>
-            <w:top w:w="0" w:type="dxa"/>
-            <w:left w:w="10" w:type="dxa"/>
-            <w:bottom w:w="0" w:type="dxa"/>
-            <w:right w:w="10" w:type="dxa"/>
+            <w:left w:w="108" w:type="dxa"/>
+            <w:right w:w="108" w:type="dxa"/>
           </w:tblCellMar>
         </w:tblPrEx>
         <w:tc>
           <w:tcPr>
-            <w:tcW w:w="1100" w:type="dxa"/>
-            <w:tcBorders>
-              <w:top w:val="single" w:color="8C8C8C" w:sz="4" w:space="0"/>
-              <w:left w:val="single" w:color="8C8C8C" w:sz="4" w:space="0"/>
-              <w:bottom w:val="single" w:color="8C8C8C" w:sz="4" w:space="0"/>
-              <w:right w:val="single" w:color="8C8C8C" w:sz="4" w:space="0"/>
-            </w:tcBorders>
-            <w:tcMar>
-              <w:top w:w="50" w:type="dxa"/>
-              <w:left w:w="90" w:type="dxa"/>
-              <w:bottom w:w="50" w:type="dxa"/>
-              <w:right w:w="90" w:type="dxa"/>
-            </w:tcMar>
-          </w:tcPr>
-          <w:p>
-            <w:pPr>
-              <w:spacing w:after="0" w:line="252" w:lineRule="auto"/>
-              <w:jc w:val="left"/>
-              <w:rPr>
-                <w:color w:val="auto"/>
-              </w:rPr>
-            </w:pPr>
-            <w:r>
-              <w:rPr>
-                <w:rFonts w:ascii="Times New Roman" w:hAnsi="Times New Roman" w:eastAsia="Times New Roman" w:cs="Times New Roman"/>
+            <w:tcW w:w="1959" w:type="dxa"/>
+          </w:tcPr>
+          <w:p>
+            <w:pPr>
+              <w:pStyle w:val="3"/>
+              <w:spacing w:before="140" w:after="80"/>
+              <w:rPr>
+                <w:rFonts w:ascii="Times New Roman" w:hAnsi="Times New Roman" w:eastAsia="Times New Roman" w:cs="Times New Roman"/>
+                <w:b w:val="0"/>
+                <w:bCs w:val="0"/>
+                <w:color w:val="auto"/>
+                <w:vertAlign w:val="baseline"/>
+              </w:rPr>
+            </w:pPr>
+            <w:r>
+              <w:rPr>
+                <w:rFonts w:ascii="Times New Roman" w:hAnsi="Times New Roman" w:eastAsia="Times New Roman" w:cs="Times New Roman"/>
+                <w:b w:val="0"/>
+                <w:bCs w:val="0"/>
                 <w:color w:val="auto"/>
                 <w:sz w:val="21"/>
                 <w:szCs w:val="21"/>
@@ -2621,26 +2577,19 @@
         </w:tc>
         <w:tc>
           <w:tcPr>
-            <w:tcW w:w="3200" w:type="dxa"/>
-            <w:tcBorders>
-              <w:top w:val="single" w:color="8C8C8C" w:sz="4" w:space="0"/>
-              <w:left w:val="single" w:color="8C8C8C" w:sz="4" w:space="0"/>
-              <w:bottom w:val="single" w:color="8C8C8C" w:sz="4" w:space="0"/>
-              <w:right w:val="single" w:color="8C8C8C" w:sz="4" w:space="0"/>
-            </w:tcBorders>
-            <w:tcMar>
-              <w:top w:w="50" w:type="dxa"/>
-              <w:left w:w="90" w:type="dxa"/>
-              <w:bottom w:w="50" w:type="dxa"/>
-              <w:right w:w="90" w:type="dxa"/>
-            </w:tcMar>
-          </w:tcPr>
-          <w:p>
-            <w:pPr>
-              <w:spacing w:after="0" w:line="252" w:lineRule="auto"/>
-              <w:jc w:val="left"/>
-              <w:rPr>
-                <w:color w:val="auto"/>
+            <w:tcW w:w="1954" w:type="dxa"/>
+            <w:shd w:val="clear"/>
+            <w:vAlign w:val="top"/>
+          </w:tcPr>
+          <w:p>
+            <w:pPr>
+              <w:spacing w:after="0" w:line="252" w:lineRule="auto"/>
+              <w:jc w:val="left"/>
+              <w:rPr>
+                <w:rFonts w:ascii="Times New Roman" w:hAnsi="Times New Roman" w:eastAsia="Times New Roman" w:cs="Times New Roman"/>
+                <w:color w:val="auto"/>
+                <w:sz w:val="24"/>
+                <w:szCs w:val="24"/>
               </w:rPr>
             </w:pPr>
             <w:r>
@@ -2656,26 +2605,19 @@
         </w:tc>
         <w:tc>
           <w:tcPr>
-            <w:tcW w:w="1100" w:type="dxa"/>
-            <w:tcBorders>
-              <w:top w:val="single" w:color="8C8C8C" w:sz="4" w:space="0"/>
-              <w:left w:val="single" w:color="8C8C8C" w:sz="4" w:space="0"/>
-              <w:bottom w:val="single" w:color="8C8C8C" w:sz="4" w:space="0"/>
-              <w:right w:val="single" w:color="8C8C8C" w:sz="4" w:space="0"/>
-            </w:tcBorders>
-            <w:tcMar>
-              <w:top w:w="50" w:type="dxa"/>
-              <w:left w:w="90" w:type="dxa"/>
-              <w:bottom w:w="50" w:type="dxa"/>
-              <w:right w:w="90" w:type="dxa"/>
-            </w:tcMar>
-          </w:tcPr>
-          <w:p>
-            <w:pPr>
-              <w:spacing w:after="0" w:line="252" w:lineRule="auto"/>
-              <w:jc w:val="left"/>
-              <w:rPr>
-                <w:color w:val="auto"/>
+            <w:tcW w:w="1956" w:type="dxa"/>
+            <w:shd w:val="clear"/>
+            <w:vAlign w:val="top"/>
+          </w:tcPr>
+          <w:p>
+            <w:pPr>
+              <w:spacing w:after="0" w:line="252" w:lineRule="auto"/>
+              <w:jc w:val="left"/>
+              <w:rPr>
+                <w:rFonts w:ascii="Times New Roman" w:hAnsi="Times New Roman" w:eastAsia="Times New Roman" w:cs="Times New Roman"/>
+                <w:color w:val="auto"/>
+                <w:sz w:val="24"/>
+                <w:szCs w:val="24"/>
               </w:rPr>
             </w:pPr>
             <w:r>
@@ -2691,26 +2633,19 @@
         </w:tc>
         <w:tc>
           <w:tcPr>
-            <w:tcW w:w="2438" w:type="dxa"/>
-            <w:tcBorders>
-              <w:top w:val="single" w:color="8C8C8C" w:sz="4" w:space="0"/>
-              <w:left w:val="single" w:color="8C8C8C" w:sz="4" w:space="0"/>
-              <w:bottom w:val="single" w:color="8C8C8C" w:sz="4" w:space="0"/>
-              <w:right w:val="single" w:color="8C8C8C" w:sz="4" w:space="0"/>
-            </w:tcBorders>
-            <w:tcMar>
-              <w:top w:w="50" w:type="dxa"/>
-              <w:left w:w="90" w:type="dxa"/>
-              <w:bottom w:w="50" w:type="dxa"/>
-              <w:right w:w="90" w:type="dxa"/>
-            </w:tcMar>
-          </w:tcPr>
-          <w:p>
-            <w:pPr>
-              <w:spacing w:after="0" w:line="252" w:lineRule="auto"/>
-              <w:jc w:val="left"/>
-              <w:rPr>
-                <w:color w:val="auto"/>
+            <w:tcW w:w="1958" w:type="dxa"/>
+            <w:shd w:val="clear"/>
+            <w:vAlign w:val="top"/>
+          </w:tcPr>
+          <w:p>
+            <w:pPr>
+              <w:spacing w:after="0" w:line="252" w:lineRule="auto"/>
+              <w:jc w:val="left"/>
+              <w:rPr>
+                <w:rFonts w:ascii="Times New Roman" w:hAnsi="Times New Roman" w:eastAsia="Times New Roman" w:cs="Times New Roman"/>
+                <w:color w:val="auto"/>
+                <w:sz w:val="24"/>
+                <w:szCs w:val="24"/>
               </w:rPr>
             </w:pPr>
             <w:r>
@@ -2726,26 +2661,19 @@
         </w:tc>
         <w:tc>
           <w:tcPr>
-            <w:tcW w:w="1800" w:type="dxa"/>
-            <w:tcBorders>
-              <w:top w:val="single" w:color="8C8C8C" w:sz="4" w:space="0"/>
-              <w:left w:val="single" w:color="8C8C8C" w:sz="4" w:space="0"/>
-              <w:bottom w:val="single" w:color="8C8C8C" w:sz="4" w:space="0"/>
-              <w:right w:val="single" w:color="8C8C8C" w:sz="4" w:space="0"/>
-            </w:tcBorders>
-            <w:tcMar>
-              <w:top w:w="50" w:type="dxa"/>
-              <w:left w:w="90" w:type="dxa"/>
-              <w:bottom w:w="50" w:type="dxa"/>
-              <w:right w:w="90" w:type="dxa"/>
-            </w:tcMar>
-          </w:tcPr>
-          <w:p>
-            <w:pPr>
-              <w:spacing w:after="0" w:line="252" w:lineRule="auto"/>
-              <w:jc w:val="left"/>
-              <w:rPr>
-                <w:color w:val="auto"/>
+            <w:tcW w:w="2019" w:type="dxa"/>
+            <w:shd w:val="clear"/>
+            <w:vAlign w:val="top"/>
+          </w:tcPr>
+          <w:p>
+            <w:pPr>
+              <w:spacing w:after="0" w:line="252" w:lineRule="auto"/>
+              <w:jc w:val="left"/>
+              <w:rPr>
+                <w:rFonts w:ascii="Times New Roman" w:hAnsi="Times New Roman" w:eastAsia="Times New Roman" w:cs="Times New Roman"/>
+                <w:color w:val="auto"/>
+                <w:sz w:val="24"/>
+                <w:szCs w:val="24"/>
               </w:rPr>
             </w:pPr>
             <w:r>
@@ -2771,34 +2699,25 @@
             <w:insideV w:val="single" w:color="auto" w:sz="4" w:space="0"/>
           </w:tblBorders>
           <w:tblCellMar>
-            <w:top w:w="0" w:type="dxa"/>
-            <w:left w:w="10" w:type="dxa"/>
-            <w:bottom w:w="0" w:type="dxa"/>
-            <w:right w:w="10" w:type="dxa"/>
+            <w:left w:w="108" w:type="dxa"/>
+            <w:right w:w="108" w:type="dxa"/>
           </w:tblCellMar>
         </w:tblPrEx>
         <w:tc>
           <w:tcPr>
-            <w:tcW w:w="1100" w:type="dxa"/>
-            <w:tcBorders>
-              <w:top w:val="single" w:color="8C8C8C" w:sz="4" w:space="0"/>
-              <w:left w:val="single" w:color="8C8C8C" w:sz="4" w:space="0"/>
-              <w:bottom w:val="single" w:color="8C8C8C" w:sz="4" w:space="0"/>
-              <w:right w:val="single" w:color="8C8C8C" w:sz="4" w:space="0"/>
-            </w:tcBorders>
-            <w:tcMar>
-              <w:top w:w="50" w:type="dxa"/>
-              <w:left w:w="90" w:type="dxa"/>
-              <w:bottom w:w="50" w:type="dxa"/>
-              <w:right w:w="90" w:type="dxa"/>
-            </w:tcMar>
-          </w:tcPr>
-          <w:p>
-            <w:pPr>
-              <w:spacing w:after="0" w:line="252" w:lineRule="auto"/>
-              <w:jc w:val="left"/>
-              <w:rPr>
-                <w:color w:val="auto"/>
+            <w:tcW w:w="1959" w:type="dxa"/>
+            <w:shd w:val="clear"/>
+            <w:vAlign w:val="top"/>
+          </w:tcPr>
+          <w:p>
+            <w:pPr>
+              <w:spacing w:after="0" w:line="252" w:lineRule="auto"/>
+              <w:jc w:val="left"/>
+              <w:rPr>
+                <w:rFonts w:ascii="Times New Roman" w:hAnsi="Times New Roman" w:eastAsia="Times New Roman" w:cs="Times New Roman"/>
+                <w:color w:val="auto"/>
+                <w:sz w:val="24"/>
+                <w:szCs w:val="24"/>
               </w:rPr>
             </w:pPr>
             <w:r>
@@ -2814,26 +2733,19 @@
         </w:tc>
         <w:tc>
           <w:tcPr>
-            <w:tcW w:w="3200" w:type="dxa"/>
-            <w:tcBorders>
-              <w:top w:val="single" w:color="8C8C8C" w:sz="4" w:space="0"/>
-              <w:left w:val="single" w:color="8C8C8C" w:sz="4" w:space="0"/>
-              <w:bottom w:val="single" w:color="8C8C8C" w:sz="4" w:space="0"/>
-              <w:right w:val="single" w:color="8C8C8C" w:sz="4" w:space="0"/>
-            </w:tcBorders>
-            <w:tcMar>
-              <w:top w:w="50" w:type="dxa"/>
-              <w:left w:w="90" w:type="dxa"/>
-              <w:bottom w:w="50" w:type="dxa"/>
-              <w:right w:w="90" w:type="dxa"/>
-            </w:tcMar>
-          </w:tcPr>
-          <w:p>
-            <w:pPr>
-              <w:spacing w:after="0" w:line="252" w:lineRule="auto"/>
-              <w:jc w:val="left"/>
-              <w:rPr>
-                <w:color w:val="auto"/>
+            <w:tcW w:w="1954" w:type="dxa"/>
+            <w:shd w:val="clear"/>
+            <w:vAlign w:val="top"/>
+          </w:tcPr>
+          <w:p>
+            <w:pPr>
+              <w:spacing w:after="0" w:line="252" w:lineRule="auto"/>
+              <w:jc w:val="left"/>
+              <w:rPr>
+                <w:rFonts w:ascii="Times New Roman" w:hAnsi="Times New Roman" w:eastAsia="Times New Roman" w:cs="Times New Roman"/>
+                <w:color w:val="auto"/>
+                <w:sz w:val="24"/>
+                <w:szCs w:val="24"/>
               </w:rPr>
             </w:pPr>
             <w:r>
@@ -2849,26 +2761,19 @@
         </w:tc>
         <w:tc>
           <w:tcPr>
-            <w:tcW w:w="1100" w:type="dxa"/>
-            <w:tcBorders>
-              <w:top w:val="single" w:color="8C8C8C" w:sz="4" w:space="0"/>
-              <w:left w:val="single" w:color="8C8C8C" w:sz="4" w:space="0"/>
-              <w:bottom w:val="single" w:color="8C8C8C" w:sz="4" w:space="0"/>
-              <w:right w:val="single" w:color="8C8C8C" w:sz="4" w:space="0"/>
-            </w:tcBorders>
-            <w:tcMar>
-              <w:top w:w="50" w:type="dxa"/>
-              <w:left w:w="90" w:type="dxa"/>
-              <w:bottom w:w="50" w:type="dxa"/>
-              <w:right w:w="90" w:type="dxa"/>
-            </w:tcMar>
-          </w:tcPr>
-          <w:p>
-            <w:pPr>
-              <w:spacing w:after="0" w:line="252" w:lineRule="auto"/>
-              <w:jc w:val="left"/>
-              <w:rPr>
-                <w:color w:val="auto"/>
+            <w:tcW w:w="1956" w:type="dxa"/>
+            <w:shd w:val="clear"/>
+            <w:vAlign w:val="top"/>
+          </w:tcPr>
+          <w:p>
+            <w:pPr>
+              <w:spacing w:after="0" w:line="252" w:lineRule="auto"/>
+              <w:jc w:val="left"/>
+              <w:rPr>
+                <w:rFonts w:ascii="Times New Roman" w:hAnsi="Times New Roman" w:eastAsia="Times New Roman" w:cs="Times New Roman"/>
+                <w:color w:val="auto"/>
+                <w:sz w:val="24"/>
+                <w:szCs w:val="24"/>
               </w:rPr>
             </w:pPr>
             <w:r>
@@ -2884,26 +2789,19 @@
         </w:tc>
         <w:tc>
           <w:tcPr>
-            <w:tcW w:w="2438" w:type="dxa"/>
-            <w:tcBorders>
-              <w:top w:val="single" w:color="8C8C8C" w:sz="4" w:space="0"/>
-              <w:left w:val="single" w:color="8C8C8C" w:sz="4" w:space="0"/>
-              <w:bottom w:val="single" w:color="8C8C8C" w:sz="4" w:space="0"/>
-              <w:right w:val="single" w:color="8C8C8C" w:sz="4" w:space="0"/>
-            </w:tcBorders>
-            <w:tcMar>
-              <w:top w:w="50" w:type="dxa"/>
-              <w:left w:w="90" w:type="dxa"/>
-              <w:bottom w:w="50" w:type="dxa"/>
-              <w:right w:w="90" w:type="dxa"/>
-            </w:tcMar>
-          </w:tcPr>
-          <w:p>
-            <w:pPr>
-              <w:spacing w:after="0" w:line="252" w:lineRule="auto"/>
-              <w:jc w:val="left"/>
-              <w:rPr>
-                <w:color w:val="auto"/>
+            <w:tcW w:w="1958" w:type="dxa"/>
+            <w:shd w:val="clear"/>
+            <w:vAlign w:val="top"/>
+          </w:tcPr>
+          <w:p>
+            <w:pPr>
+              <w:spacing w:after="0" w:line="252" w:lineRule="auto"/>
+              <w:jc w:val="left"/>
+              <w:rPr>
+                <w:rFonts w:ascii="Times New Roman" w:hAnsi="Times New Roman" w:eastAsia="Times New Roman" w:cs="Times New Roman"/>
+                <w:color w:val="auto"/>
+                <w:sz w:val="24"/>
+                <w:szCs w:val="24"/>
               </w:rPr>
             </w:pPr>
             <w:r>
@@ -2919,26 +2817,19 @@
         </w:tc>
         <w:tc>
           <w:tcPr>
-            <w:tcW w:w="1800" w:type="dxa"/>
-            <w:tcBorders>
-              <w:top w:val="single" w:color="8C8C8C" w:sz="4" w:space="0"/>
-              <w:left w:val="single" w:color="8C8C8C" w:sz="4" w:space="0"/>
-              <w:bottom w:val="single" w:color="8C8C8C" w:sz="4" w:space="0"/>
-              <w:right w:val="single" w:color="8C8C8C" w:sz="4" w:space="0"/>
-            </w:tcBorders>
-            <w:tcMar>
-              <w:top w:w="50" w:type="dxa"/>
-              <w:left w:w="90" w:type="dxa"/>
-              <w:bottom w:w="50" w:type="dxa"/>
-              <w:right w:w="90" w:type="dxa"/>
-            </w:tcMar>
-          </w:tcPr>
-          <w:p>
-            <w:pPr>
-              <w:spacing w:after="0" w:line="252" w:lineRule="auto"/>
-              <w:jc w:val="left"/>
-              <w:rPr>
-                <w:color w:val="auto"/>
+            <w:tcW w:w="2019" w:type="dxa"/>
+            <w:shd w:val="clear"/>
+            <w:vAlign w:val="top"/>
+          </w:tcPr>
+          <w:p>
+            <w:pPr>
+              <w:spacing w:after="0" w:line="252" w:lineRule="auto"/>
+              <w:jc w:val="left"/>
+              <w:rPr>
+                <w:rFonts w:ascii="Times New Roman" w:hAnsi="Times New Roman" w:eastAsia="Times New Roman" w:cs="Times New Roman"/>
+                <w:color w:val="auto"/>
+                <w:sz w:val="24"/>
+                <w:szCs w:val="24"/>
               </w:rPr>
             </w:pPr>
             <w:r>
@@ -3120,7 +3011,7 @@
           <w:sz w:val="21"/>
           <w:szCs w:val="21"/>
         </w:rPr>
-        <w:t xml:space="preserve">title</w:t>
+        <w:t>title</w:t>
       </w:r>
       <w:r>
         <w:rPr>
@@ -3148,7 +3039,7 @@
     </w:p>
     <w:p>
       <w:pPr>
-        <w:pStyle w:val="18"/>
+        <w:pStyle w:val="19"/>
         <w:numPr>
           <w:ilvl w:val="0"/>
           <w:numId w:val="1"/>
@@ -3194,7 +3085,7 @@
     </w:p>
     <w:p>
       <w:pPr>
-        <w:pStyle w:val="18"/>
+        <w:pStyle w:val="19"/>
         <w:numPr>
           <w:ilvl w:val="0"/>
           <w:numId w:val="1"/>
@@ -3272,7 +3163,7 @@
     </w:p>
     <w:p>
       <w:pPr>
-        <w:pStyle w:val="18"/>
+        <w:pStyle w:val="19"/>
         <w:numPr>
           <w:ilvl w:val="0"/>
           <w:numId w:val="1"/>
@@ -3350,7 +3241,7 @@
     </w:p>
     <w:p>
       <w:pPr>
-        <w:pStyle w:val="18"/>
+        <w:pStyle w:val="19"/>
         <w:numPr>
           <w:ilvl w:val="0"/>
           <w:numId w:val="1"/>
@@ -3375,7 +3266,7 @@
           <w:bCs/>
           <w:color w:val="auto"/>
         </w:rPr>
-        <w:t xml:space="preserve">216 chunk</w:t>
+        <w:t>216 chunk</w:t>
       </w:r>
       <w:r>
         <w:rPr>
@@ -3386,30 +3277,24 @@
       </w:r>
     </w:p>
     <w:p>
-      <w:pPr>
-        <w:shd w:val="clear" w:color="auto" w:fill="EAF1DD"/>
-        <w:spacing w:before="80" w:after="120" w:line="276" w:lineRule="auto"/>
-        <w:ind w:left="150" w:right="150"/>
-        <w:jc w:val="both"/>
-        <w:rPr>
-          <w:color w:val="auto"/>
-        </w:rPr>
-      </w:pPr>
-      <w:r>
-        <w:rPr>
-          <w:rFonts w:ascii="Times New Roman" w:hAnsi="Times New Roman" w:eastAsia="Times New Roman" w:cs="Times New Roman"/>
+      <w:r>
+        <w:rPr>
+          <w:rFonts w:hint="default"/>
           <w:b/>
           <w:bCs/>
-          <w:color w:val="auto"/>
-        </w:rPr>
-        <w:t>Lý do chia chunk như vậy:</w:t>
-      </w:r>
-      <w:r>
-        <w:rPr>
-          <w:rFonts w:ascii="Times New Roman" w:hAnsi="Times New Roman" w:eastAsia="Times New Roman" w:cs="Times New Roman"/>
-          <w:color w:val="auto"/>
-        </w:rPr>
-        <w:t xml:space="preserve"> (1) Quy định được viết theo từng Điều, mỗi Điều nói về một chủ đề, nên cắt theo Điều giữ trọn nghĩa và cho phép trích dẫn đúng “Điều n”. (2) Bảng phụ lục là nơi có con số cộng/trừ điểm; nếu để chung một khối thì vector của cả bảng bị “trung bình hoá”, câu hỏi về một mục nhỏ không tìm thấy. (3) Model embedding chỉ đọc khoảng 128 token đầu (~500 ký tự tiếng Việt), phần sau bị bỏ, nên mỗi chunk phải ≤ 500 ký tự. (4) Giữ dòng tiêu đề ở mỗi phần để chunk con vẫn biết mình thuộc Điều nào và LLM vẫn ghi được nguồn.</w:t>
+          <w:lang w:val="en-US"/>
+        </w:rPr>
+        <w:t>Mục đích</w:t>
+      </w:r>
+      <w:r>
+        <w:rPr>
+          <w:b/>
+          <w:bCs/>
+        </w:rPr>
+        <w:t xml:space="preserve"> chia chunk: </w:t>
+      </w:r>
+      <w:r>
+        <w:t>(1) Quy định được viết theo từng Điều, mỗi Điều nói về một chủ đề, nên cắt theo Điều giữ trọn nghĩa và cho phép trích dẫn đúng “Điều n”. (2) Bảng phụ lục là nơi có con số cộng/trừ điểm; nếu để chung một khối thì vector của cả bảng bị “trung bình hoá”, câu hỏi về một mục nhỏ không tìm thấy. (3) Model embedding chỉ đọc khoảng 128 token đầu (~500 ký tự tiếng Việt), phần sau bị bỏ, nên mỗi chunk phải ≤ 500 ký tự. (4) Giữ dòng tiêu đề ở mỗi phần để chunk con vẫn biết mình thuộc Điều nào và LLM vẫn ghi được nguồn.</w:t>
       </w:r>
     </w:p>
     <w:p>
@@ -3462,12 +3347,29 @@
     </w:p>
     <w:p>
       <w:pPr>
+        <w:rPr>
+          <w:rFonts w:ascii="Times New Roman" w:hAnsi="Times New Roman" w:eastAsia="Times New Roman" w:cs="Times New Roman"/>
+          <w:color w:val="auto"/>
+        </w:rPr>
+      </w:pPr>
+      <w:r>
+        <w:rPr>
+          <w:rFonts w:ascii="Times New Roman" w:hAnsi="Times New Roman" w:eastAsia="Times New Roman" w:cs="Times New Roman"/>
+          <w:color w:val="auto"/>
+        </w:rPr>
+        <w:br w:type="page"/>
+      </w:r>
+    </w:p>
+    <w:p>
+      <w:pPr>
         <w:pStyle w:val="3"/>
         <w:spacing w:before="140" w:after="80"/>
         <w:rPr>
           <w:color w:val="auto"/>
         </w:rPr>
       </w:pPr>
+      <w:bookmarkStart w:id="0" w:name="_GoBack"/>
+      <w:bookmarkEnd w:id="0"/>
       <w:r>
         <w:rPr>
           <w:rFonts w:ascii="Times New Roman" w:hAnsi="Times New Roman" w:eastAsia="Times New Roman" w:cs="Times New Roman"/>
@@ -3757,7 +3659,7 @@
           <w:sz w:val="21"/>
           <w:szCs w:val="21"/>
         </w:rPr>
-        <w:t xml:space="preserve">prompts.txt</w:t>
+        <w:t>prompts.txt</w:t>
       </w:r>
       <w:r>
         <w:rPr>
@@ -3773,7 +3675,7 @@
           <w:sz w:val="21"/>
           <w:szCs w:val="21"/>
         </w:rPr>
-        <w:t xml:space="preserve">calculate_training_score</w:t>
+        <w:t>calculate_training_score</w:t>
       </w:r>
       <w:r>
         <w:rPr>
@@ -4210,9 +4112,6 @@
             <w:right w:w="10" w:type="dxa"/>
           </w:tblCellMar>
         </w:tblPrEx>
-        <w:trPr>
-          <w:tblHeader/>
-        </w:trPr>
         <w:tc>
           <w:tcPr>
             <w:tcW w:w="2600" w:type="dxa"/>
@@ -4222,30 +4121,34 @@
               <w:bottom w:val="single" w:color="8C8C8C" w:sz="4" w:space="0"/>
               <w:right w:val="single" w:color="8C8C8C" w:sz="4" w:space="0"/>
             </w:tcBorders>
-            <w:shd w:val="clear" w:color="auto" w:fill="D9E2F3"/>
-            <w:tcMar>
-              <w:top w:w="50" w:type="dxa"/>
-              <w:left w:w="90" w:type="dxa"/>
-              <w:bottom w:w="50" w:type="dxa"/>
-              <w:right w:w="90" w:type="dxa"/>
-            </w:tcMar>
-          </w:tcPr>
-          <w:p>
-            <w:pPr>
-              <w:spacing w:after="0" w:line="252" w:lineRule="auto"/>
-              <w:jc w:val="left"/>
-              <w:rPr>
-                <w:color w:val="auto"/>
-              </w:rPr>
-            </w:pPr>
-            <w:r>
-              <w:rPr>
-                <w:rFonts w:ascii="Times New Roman" w:hAnsi="Times New Roman" w:eastAsia="Times New Roman" w:cs="Times New Roman"/>
+            <w:tcMar>
+              <w:top w:w="50" w:type="dxa"/>
+              <w:left w:w="90" w:type="dxa"/>
+              <w:bottom w:w="50" w:type="dxa"/>
+              <w:right w:w="90" w:type="dxa"/>
+            </w:tcMar>
+          </w:tcPr>
+          <w:p>
+            <w:pPr>
+              <w:spacing w:after="0" w:line="252" w:lineRule="auto"/>
+              <w:jc w:val="left"/>
+              <w:rPr>
+                <w:rFonts w:hint="default"/>
                 <w:b/>
                 <w:bCs/>
                 <w:color w:val="auto"/>
+                <w:lang w:val="en-US"/>
+              </w:rPr>
+            </w:pPr>
+            <w:r>
+              <w:rPr>
+                <w:rFonts w:hint="default" w:cs="Times New Roman"/>
+                <w:b/>
+                <w:bCs/>
+                <w:color w:val="auto"/>
                 <w:sz w:val="21"/>
                 <w:szCs w:val="21"/>
+                <w:lang w:val="en-US"/>
               </w:rPr>
               <w:t>Tool</w:t>
             </w:r>
@@ -4260,19 +4163,21 @@
               <w:bottom w:val="single" w:color="8C8C8C" w:sz="4" w:space="0"/>
               <w:right w:val="single" w:color="8C8C8C" w:sz="4" w:space="0"/>
             </w:tcBorders>
-            <w:shd w:val="clear" w:color="auto" w:fill="D9E2F3"/>
-            <w:tcMar>
-              <w:top w:w="50" w:type="dxa"/>
-              <w:left w:w="90" w:type="dxa"/>
-              <w:bottom w:w="50" w:type="dxa"/>
-              <w:right w:w="90" w:type="dxa"/>
-            </w:tcMar>
-          </w:tcPr>
-          <w:p>
-            <w:pPr>
-              <w:spacing w:after="0" w:line="252" w:lineRule="auto"/>
-              <w:jc w:val="left"/>
-              <w:rPr>
+            <w:tcMar>
+              <w:top w:w="50" w:type="dxa"/>
+              <w:left w:w="90" w:type="dxa"/>
+              <w:bottom w:w="50" w:type="dxa"/>
+              <w:right w:w="90" w:type="dxa"/>
+            </w:tcMar>
+            <w:vAlign w:val="top"/>
+          </w:tcPr>
+          <w:p>
+            <w:pPr>
+              <w:spacing w:after="0" w:line="252" w:lineRule="auto"/>
+              <w:jc w:val="left"/>
+              <w:rPr>
+                <w:b/>
+                <w:bCs/>
                 <w:color w:val="auto"/>
               </w:rPr>
             </w:pPr>
@@ -4375,6 +4280,82 @@
               </w:rPr>
               <w:t>Tra quy định khi phần “Tài liệu RAG” chưa đủ; chỉ dùng nội dung tài liệu, ghi nguồn doc_id + Điều.</w:t>
             </w:r>
+          </w:p>
+        </w:tc>
+      </w:tr>
+      <w:tr>
+        <w:tblPrEx>
+          <w:tblBorders>
+            <w:top w:val="single" w:color="auto" w:sz="4" w:space="0"/>
+            <w:left w:val="single" w:color="auto" w:sz="4" w:space="0"/>
+            <w:bottom w:val="single" w:color="auto" w:sz="4" w:space="0"/>
+            <w:right w:val="single" w:color="auto" w:sz="4" w:space="0"/>
+            <w:insideH w:val="single" w:color="auto" w:sz="4" w:space="0"/>
+            <w:insideV w:val="single" w:color="auto" w:sz="4" w:space="0"/>
+          </w:tblBorders>
+          <w:tblCellMar>
+            <w:top w:w="0" w:type="dxa"/>
+            <w:left w:w="10" w:type="dxa"/>
+            <w:bottom w:w="0" w:type="dxa"/>
+            <w:right w:w="10" w:type="dxa"/>
+          </w:tblCellMar>
+        </w:tblPrEx>
+        <w:tc>
+          <w:tcPr>
+            <w:tcW w:w="2600" w:type="dxa"/>
+            <w:tcBorders>
+              <w:top w:val="single" w:color="8C8C8C" w:sz="4" w:space="0"/>
+              <w:left w:val="single" w:color="8C8C8C" w:sz="4" w:space="0"/>
+              <w:bottom w:val="single" w:color="8C8C8C" w:sz="4" w:space="0"/>
+              <w:right w:val="single" w:color="8C8C8C" w:sz="4" w:space="0"/>
+            </w:tcBorders>
+            <w:tcMar>
+              <w:top w:w="50" w:type="dxa"/>
+              <w:left w:w="90" w:type="dxa"/>
+              <w:bottom w:w="50" w:type="dxa"/>
+              <w:right w:w="90" w:type="dxa"/>
+            </w:tcMar>
+          </w:tcPr>
+          <w:p>
+            <w:pPr>
+              <w:spacing w:after="0" w:line="252" w:lineRule="auto"/>
+              <w:jc w:val="left"/>
+              <w:rPr>
+                <w:rFonts w:ascii="Times New Roman" w:hAnsi="Times New Roman" w:eastAsia="Times New Roman" w:cs="Times New Roman"/>
+                <w:color w:val="auto"/>
+                <w:sz w:val="21"/>
+                <w:szCs w:val="21"/>
+              </w:rPr>
+            </w:pPr>
+          </w:p>
+        </w:tc>
+        <w:tc>
+          <w:tcPr>
+            <w:tcW w:w="7038" w:type="dxa"/>
+            <w:tcBorders>
+              <w:top w:val="single" w:color="8C8C8C" w:sz="4" w:space="0"/>
+              <w:left w:val="single" w:color="8C8C8C" w:sz="4" w:space="0"/>
+              <w:bottom w:val="single" w:color="8C8C8C" w:sz="4" w:space="0"/>
+              <w:right w:val="single" w:color="8C8C8C" w:sz="4" w:space="0"/>
+            </w:tcBorders>
+            <w:tcMar>
+              <w:top w:w="50" w:type="dxa"/>
+              <w:left w:w="90" w:type="dxa"/>
+              <w:bottom w:w="50" w:type="dxa"/>
+              <w:right w:w="90" w:type="dxa"/>
+            </w:tcMar>
+          </w:tcPr>
+          <w:p>
+            <w:pPr>
+              <w:spacing w:after="0" w:line="252" w:lineRule="auto"/>
+              <w:jc w:val="left"/>
+              <w:rPr>
+                <w:rFonts w:ascii="Times New Roman" w:hAnsi="Times New Roman" w:eastAsia="Times New Roman" w:cs="Times New Roman"/>
+                <w:color w:val="auto"/>
+                <w:sz w:val="21"/>
+                <w:szCs w:val="21"/>
+              </w:rPr>
+            </w:pPr>
           </w:p>
         </w:tc>
       </w:tr>
@@ -5020,9 +5001,6 @@
             <w:right w:w="10" w:type="dxa"/>
           </w:tblCellMar>
         </w:tblPrEx>
-        <w:trPr>
-          <w:tblHeader/>
-        </w:trPr>
         <w:tc>
           <w:tcPr>
             <w:tcW w:w="2500" w:type="dxa"/>
@@ -5032,30 +5010,34 @@
               <w:bottom w:val="single" w:color="8C8C8C" w:sz="4" w:space="0"/>
               <w:right w:val="single" w:color="8C8C8C" w:sz="4" w:space="0"/>
             </w:tcBorders>
-            <w:shd w:val="clear" w:color="auto" w:fill="D9E2F3"/>
-            <w:tcMar>
-              <w:top w:w="50" w:type="dxa"/>
-              <w:left w:w="90" w:type="dxa"/>
-              <w:bottom w:w="50" w:type="dxa"/>
-              <w:right w:w="90" w:type="dxa"/>
-            </w:tcMar>
-          </w:tcPr>
-          <w:p>
-            <w:pPr>
-              <w:spacing w:after="0" w:line="252" w:lineRule="auto"/>
-              <w:jc w:val="left"/>
-              <w:rPr>
-                <w:color w:val="auto"/>
-              </w:rPr>
-            </w:pPr>
-            <w:r>
-              <w:rPr>
-                <w:rFonts w:ascii="Times New Roman" w:hAnsi="Times New Roman" w:eastAsia="Times New Roman" w:cs="Times New Roman"/>
+            <w:tcMar>
+              <w:top w:w="50" w:type="dxa"/>
+              <w:left w:w="90" w:type="dxa"/>
+              <w:bottom w:w="50" w:type="dxa"/>
+              <w:right w:w="90" w:type="dxa"/>
+            </w:tcMar>
+          </w:tcPr>
+          <w:p>
+            <w:pPr>
+              <w:spacing w:after="0" w:line="252" w:lineRule="auto"/>
+              <w:jc w:val="left"/>
+              <w:rPr>
+                <w:rFonts w:hint="default"/>
                 <w:b/>
                 <w:bCs/>
                 <w:color w:val="auto"/>
+                <w:lang w:val="en-US"/>
+              </w:rPr>
+            </w:pPr>
+            <w:r>
+              <w:rPr>
+                <w:rFonts w:hint="default" w:cs="Times New Roman"/>
+                <w:b/>
+                <w:bCs/>
+                <w:color w:val="auto"/>
                 <w:sz w:val="21"/>
                 <w:szCs w:val="21"/>
+                <w:lang w:val="en-US"/>
               </w:rPr>
               <w:t>Tình huống</w:t>
             </w:r>
@@ -5070,30 +5052,34 @@
               <w:bottom w:val="single" w:color="8C8C8C" w:sz="4" w:space="0"/>
               <w:right w:val="single" w:color="8C8C8C" w:sz="4" w:space="0"/>
             </w:tcBorders>
-            <w:shd w:val="clear" w:color="auto" w:fill="D9E2F3"/>
-            <w:tcMar>
-              <w:top w:w="50" w:type="dxa"/>
-              <w:left w:w="90" w:type="dxa"/>
-              <w:bottom w:w="50" w:type="dxa"/>
-              <w:right w:w="90" w:type="dxa"/>
-            </w:tcMar>
-          </w:tcPr>
-          <w:p>
-            <w:pPr>
-              <w:spacing w:after="0" w:line="252" w:lineRule="auto"/>
-              <w:jc w:val="left"/>
-              <w:rPr>
-                <w:color w:val="auto"/>
-              </w:rPr>
-            </w:pPr>
-            <w:r>
-              <w:rPr>
-                <w:rFonts w:ascii="Times New Roman" w:hAnsi="Times New Roman" w:eastAsia="Times New Roman" w:cs="Times New Roman"/>
+            <w:tcMar>
+              <w:top w:w="50" w:type="dxa"/>
+              <w:left w:w="90" w:type="dxa"/>
+              <w:bottom w:w="50" w:type="dxa"/>
+              <w:right w:w="90" w:type="dxa"/>
+            </w:tcMar>
+          </w:tcPr>
+          <w:p>
+            <w:pPr>
+              <w:spacing w:after="0" w:line="252" w:lineRule="auto"/>
+              <w:jc w:val="left"/>
+              <w:rPr>
+                <w:rFonts w:hint="default"/>
                 <w:b/>
                 <w:bCs/>
                 <w:color w:val="auto"/>
+                <w:lang w:val="en-US"/>
+              </w:rPr>
+            </w:pPr>
+            <w:r>
+              <w:rPr>
+                <w:rFonts w:hint="default" w:cs="Times New Roman"/>
+                <w:b/>
+                <w:bCs/>
+                <w:color w:val="auto"/>
                 <w:sz w:val="21"/>
                 <w:szCs w:val="21"/>
+                <w:lang w:val="en-US"/>
               </w:rPr>
               <w:t>Nơi xử lý</w:t>
             </w:r>
@@ -5108,30 +5094,34 @@
               <w:bottom w:val="single" w:color="8C8C8C" w:sz="4" w:space="0"/>
               <w:right w:val="single" w:color="8C8C8C" w:sz="4" w:space="0"/>
             </w:tcBorders>
-            <w:shd w:val="clear" w:color="auto" w:fill="D9E2F3"/>
-            <w:tcMar>
-              <w:top w:w="50" w:type="dxa"/>
-              <w:left w:w="90" w:type="dxa"/>
-              <w:bottom w:w="50" w:type="dxa"/>
-              <w:right w:w="90" w:type="dxa"/>
-            </w:tcMar>
-          </w:tcPr>
-          <w:p>
-            <w:pPr>
-              <w:spacing w:after="0" w:line="252" w:lineRule="auto"/>
-              <w:jc w:val="left"/>
-              <w:rPr>
-                <w:color w:val="auto"/>
-              </w:rPr>
-            </w:pPr>
-            <w:r>
-              <w:rPr>
-                <w:rFonts w:ascii="Times New Roman" w:hAnsi="Times New Roman" w:eastAsia="Times New Roman" w:cs="Times New Roman"/>
+            <w:tcMar>
+              <w:top w:w="50" w:type="dxa"/>
+              <w:left w:w="90" w:type="dxa"/>
+              <w:bottom w:w="50" w:type="dxa"/>
+              <w:right w:w="90" w:type="dxa"/>
+            </w:tcMar>
+          </w:tcPr>
+          <w:p>
+            <w:pPr>
+              <w:spacing w:after="0" w:line="252" w:lineRule="auto"/>
+              <w:jc w:val="left"/>
+              <w:rPr>
+                <w:rFonts w:hint="default"/>
                 <w:b/>
                 <w:bCs/>
                 <w:color w:val="auto"/>
+                <w:lang w:val="en-US"/>
+              </w:rPr>
+            </w:pPr>
+            <w:r>
+              <w:rPr>
+                <w:rFonts w:hint="default" w:cs="Times New Roman"/>
+                <w:b/>
+                <w:bCs/>
+                <w:color w:val="auto"/>
                 <w:sz w:val="21"/>
                 <w:szCs w:val="21"/>
+                <w:lang w:val="en-US"/>
               </w:rPr>
               <w:t>Cách xử lý</w:t>
             </w:r>
@@ -5299,18 +5289,12 @@
               <w:spacing w:after="0" w:line="252" w:lineRule="auto"/>
               <w:jc w:val="left"/>
               <w:rPr>
-                <w:color w:val="auto"/>
-              </w:rPr>
-            </w:pPr>
-            <w:r>
-              <w:rPr>
                 <w:rFonts w:ascii="Times New Roman" w:hAnsi="Times New Roman" w:eastAsia="Times New Roman" w:cs="Times New Roman"/>
                 <w:color w:val="auto"/>
                 <w:sz w:val="21"/>
                 <w:szCs w:val="21"/>
               </w:rPr>
-              <w:t>429 vượt giới hạn token/phút</w:t>
-            </w:r>
+            </w:pPr>
           </w:p>
         </w:tc>
         <w:tc>
@@ -5333,19 +5317,13 @@
             <w:pPr>
               <w:spacing w:after="0" w:line="252" w:lineRule="auto"/>
               <w:jc w:val="left"/>
-              <w:rPr>
-                <w:color w:val="auto"/>
-              </w:rPr>
-            </w:pPr>
-            <w:r>
               <w:rPr>
                 <w:rFonts w:ascii="Times New Roman" w:hAnsi="Times New Roman" w:eastAsia="Times New Roman" w:cs="Times New Roman"/>
                 <w:color w:val="auto"/>
                 <w:sz w:val="21"/>
                 <w:szCs w:val="21"/>
               </w:rPr>
-              <w:t>api_handler.py</w:t>
-            </w:r>
+            </w:pPr>
           </w:p>
         </w:tc>
         <w:tc>
@@ -5368,19 +5346,13 @@
             <w:pPr>
               <w:spacing w:after="0" w:line="252" w:lineRule="auto"/>
               <w:jc w:val="left"/>
-              <w:rPr>
-                <w:color w:val="auto"/>
-              </w:rPr>
-            </w:pPr>
-            <w:r>
               <w:rPr>
                 <w:rFonts w:ascii="Times New Roman" w:hAnsi="Times New Roman" w:eastAsia="Times New Roman" w:cs="Times New Roman"/>
                 <w:color w:val="auto"/>
                 <w:sz w:val="21"/>
                 <w:szCs w:val="21"/>
               </w:rPr>
-              <w:t>Đọc “try again in 47.28s” trong thông báo lỗi, chờ đúng số giây đó rồi gọi lại.</w:t>
-            </w:r>
+            </w:pPr>
           </w:p>
         </w:tc>
       </w:tr>
@@ -5432,7 +5404,7 @@
                 <w:sz w:val="21"/>
                 <w:szCs w:val="21"/>
               </w:rPr>
-              <w:t>413 prompt quá dài</w:t>
+              <w:t>429 vượt giới hạn token/phút</w:t>
             </w:r>
           </w:p>
         </w:tc>
@@ -5502,7 +5474,7 @@
                 <w:sz w:val="21"/>
                 <w:szCs w:val="21"/>
               </w:rPr>
-              <w:t>Không thử lại (gửi lại vẫn lỗi), báo lỗi rõ ràng.</w:t>
+              <w:t>Đọc “try again in 47.28s” trong thông báo lỗi, chờ đúng số giây đó rồi gọi lại.</w:t>
             </w:r>
           </w:p>
         </w:tc>
@@ -5555,7 +5527,7 @@
                 <w:sz w:val="21"/>
                 <w:szCs w:val="21"/>
               </w:rPr>
-              <w:t>LLM trả JSON hỏng / thiếu ngoặc</w:t>
+              <w:t>413 prompt quá dài</w:t>
             </w:r>
           </w:p>
         </w:tc>
@@ -5590,7 +5562,7 @@
                 <w:sz w:val="21"/>
                 <w:szCs w:val="21"/>
               </w:rPr>
-              <w:t>_parse_json</w:t>
+              <w:t>api_handler.py</w:t>
             </w:r>
           </w:p>
         </w:tc>
@@ -5625,7 +5597,7 @@
                 <w:sz w:val="21"/>
                 <w:szCs w:val="21"/>
               </w:rPr>
-              <w:t>raw_decode; thiếu “}” thì tự thêm; vẫn hỏng thì ValueError → báo “Error: …” cho LLM và cho làm lại ở bước sau.</w:t>
+              <w:t>Không thử lại (gửi lại vẫn lỗi), báo lỗi rõ ràng.</w:t>
             </w:r>
           </w:p>
         </w:tc>
@@ -5678,7 +5650,7 @@
                 <w:sz w:val="21"/>
                 <w:szCs w:val="21"/>
               </w:rPr>
-              <w:t>action / tool_name sai kiểu</w:t>
+              <w:t>LLM trả JSON hỏng / thiếu ngoặc</w:t>
             </w:r>
           </w:p>
         </w:tc>
@@ -5713,7 +5685,7 @@
                 <w:sz w:val="21"/>
                 <w:szCs w:val="21"/>
               </w:rPr>
-              <w:t>agent__loop.py</w:t>
+              <w:t>_parse_json</w:t>
             </w:r>
           </w:p>
         </w:tc>
@@ -5748,7 +5720,7 @@
                 <w:sz w:val="21"/>
                 <w:szCs w:val="21"/>
               </w:rPr>
-              <w:t>Gửi tin “Error: …” cho LLM, tiếp tục vòng lặp.</w:t>
+              <w:t>raw_decode; thiếu “}” thì tự thêm; vẫn hỏng thì ValueError → báo “Error: …” cho LLM và cho làm lại ở bước sau.</w:t>
             </w:r>
           </w:p>
         </w:tc>
@@ -5801,6 +5773,129 @@
                 <w:sz w:val="21"/>
                 <w:szCs w:val="21"/>
               </w:rPr>
+              <w:t>action / tool_name sai kiểu</w:t>
+            </w:r>
+          </w:p>
+        </w:tc>
+        <w:tc>
+          <w:tcPr>
+            <w:tcW w:w="2000" w:type="dxa"/>
+            <w:tcBorders>
+              <w:top w:val="single" w:color="8C8C8C" w:sz="4" w:space="0"/>
+              <w:left w:val="single" w:color="8C8C8C" w:sz="4" w:space="0"/>
+              <w:bottom w:val="single" w:color="8C8C8C" w:sz="4" w:space="0"/>
+              <w:right w:val="single" w:color="8C8C8C" w:sz="4" w:space="0"/>
+            </w:tcBorders>
+            <w:tcMar>
+              <w:top w:w="50" w:type="dxa"/>
+              <w:left w:w="90" w:type="dxa"/>
+              <w:bottom w:w="50" w:type="dxa"/>
+              <w:right w:w="90" w:type="dxa"/>
+            </w:tcMar>
+          </w:tcPr>
+          <w:p>
+            <w:pPr>
+              <w:spacing w:after="0" w:line="252" w:lineRule="auto"/>
+              <w:jc w:val="left"/>
+              <w:rPr>
+                <w:color w:val="auto"/>
+              </w:rPr>
+            </w:pPr>
+            <w:r>
+              <w:rPr>
+                <w:rFonts w:ascii="Times New Roman" w:hAnsi="Times New Roman" w:eastAsia="Times New Roman" w:cs="Times New Roman"/>
+                <w:color w:val="auto"/>
+                <w:sz w:val="21"/>
+                <w:szCs w:val="21"/>
+              </w:rPr>
+              <w:t>agent__loop.py</w:t>
+            </w:r>
+          </w:p>
+        </w:tc>
+        <w:tc>
+          <w:tcPr>
+            <w:tcW w:w="5138" w:type="dxa"/>
+            <w:tcBorders>
+              <w:top w:val="single" w:color="8C8C8C" w:sz="4" w:space="0"/>
+              <w:left w:val="single" w:color="8C8C8C" w:sz="4" w:space="0"/>
+              <w:bottom w:val="single" w:color="8C8C8C" w:sz="4" w:space="0"/>
+              <w:right w:val="single" w:color="8C8C8C" w:sz="4" w:space="0"/>
+            </w:tcBorders>
+            <w:tcMar>
+              <w:top w:w="50" w:type="dxa"/>
+              <w:left w:w="90" w:type="dxa"/>
+              <w:bottom w:w="50" w:type="dxa"/>
+              <w:right w:w="90" w:type="dxa"/>
+            </w:tcMar>
+          </w:tcPr>
+          <w:p>
+            <w:pPr>
+              <w:spacing w:after="0" w:line="252" w:lineRule="auto"/>
+              <w:jc w:val="left"/>
+              <w:rPr>
+                <w:color w:val="auto"/>
+              </w:rPr>
+            </w:pPr>
+            <w:r>
+              <w:rPr>
+                <w:rFonts w:ascii="Times New Roman" w:hAnsi="Times New Roman" w:eastAsia="Times New Roman" w:cs="Times New Roman"/>
+                <w:color w:val="auto"/>
+                <w:sz w:val="21"/>
+                <w:szCs w:val="21"/>
+              </w:rPr>
+              <w:t>Gửi tin “Error: …” cho LLM, tiếp tục vòng lặp.</w:t>
+            </w:r>
+          </w:p>
+        </w:tc>
+      </w:tr>
+      <w:tr>
+        <w:tblPrEx>
+          <w:tblBorders>
+            <w:top w:val="single" w:color="auto" w:sz="4" w:space="0"/>
+            <w:left w:val="single" w:color="auto" w:sz="4" w:space="0"/>
+            <w:bottom w:val="single" w:color="auto" w:sz="4" w:space="0"/>
+            <w:right w:val="single" w:color="auto" w:sz="4" w:space="0"/>
+            <w:insideH w:val="single" w:color="auto" w:sz="4" w:space="0"/>
+            <w:insideV w:val="single" w:color="auto" w:sz="4" w:space="0"/>
+          </w:tblBorders>
+          <w:tblCellMar>
+            <w:top w:w="0" w:type="dxa"/>
+            <w:left w:w="10" w:type="dxa"/>
+            <w:bottom w:w="0" w:type="dxa"/>
+            <w:right w:w="10" w:type="dxa"/>
+          </w:tblCellMar>
+        </w:tblPrEx>
+        <w:tc>
+          <w:tcPr>
+            <w:tcW w:w="2500" w:type="dxa"/>
+            <w:tcBorders>
+              <w:top w:val="single" w:color="8C8C8C" w:sz="4" w:space="0"/>
+              <w:left w:val="single" w:color="8C8C8C" w:sz="4" w:space="0"/>
+              <w:bottom w:val="single" w:color="8C8C8C" w:sz="4" w:space="0"/>
+              <w:right w:val="single" w:color="8C8C8C" w:sz="4" w:space="0"/>
+            </w:tcBorders>
+            <w:tcMar>
+              <w:top w:w="50" w:type="dxa"/>
+              <w:left w:w="90" w:type="dxa"/>
+              <w:bottom w:w="50" w:type="dxa"/>
+              <w:right w:w="90" w:type="dxa"/>
+            </w:tcMar>
+          </w:tcPr>
+          <w:p>
+            <w:pPr>
+              <w:spacing w:after="0" w:line="252" w:lineRule="auto"/>
+              <w:jc w:val="left"/>
+              <w:rPr>
+                <w:color w:val="auto"/>
+              </w:rPr>
+            </w:pPr>
+            <w:r>
+              <w:rPr>
+                <w:rFonts w:ascii="Times New Roman" w:hAnsi="Times New Roman" w:eastAsia="Times New Roman" w:cs="Times New Roman"/>
+                <w:color w:val="auto"/>
+                <w:sz w:val="21"/>
+                <w:szCs w:val="21"/>
+              </w:rPr>
               <w:t>Tool lỗi, tool không tồn tại</w:t>
             </w:r>
           </w:p>
@@ -6494,7 +6589,7 @@
           <w:rFonts w:ascii="Times New Roman" w:hAnsi="Times New Roman" w:eastAsia="Times New Roman" w:cs="Times New Roman"/>
           <w:color w:val="auto"/>
         </w:rPr>
-        <w:t xml:space="preserve">Câu hỏi về phiên bản cùng ngày (</w:t>
+        <w:t>Câu hỏi về phiên bản cùng ngày (</w:t>
       </w:r>
       <w:r>
         <w:rPr>
@@ -6503,14 +6598,14 @@
           <w:sz w:val="21"/>
           <w:szCs w:val="21"/>
         </w:rPr>
-        <w:t xml:space="preserve">python demo.py "Học kỳ này em được 90 điểm rèn luyện thì xếp loại gì?"</w:t>
-      </w:r>
-      <w:r>
-        <w:rPr>
-          <w:rFonts w:ascii="Times New Roman" w:hAnsi="Times New Roman" w:eastAsia="Times New Roman" w:cs="Times New Roman"/>
-          <w:color w:val="auto"/>
-        </w:rPr>
-        <w:t xml:space="preserve">): agent trả lời 1 bước “Tốt … điểm xuất sắc yêu cầu từ 92 điểm trở lên (doc_id: DOC0008, Điều 10)” và ghi chú “nếu hỏi về quy định cũ năm 2021, 90 điểm sẽ là loại Xuất sắc”.</w:t>
+        <w:t>python demo.py "Học kỳ này em được 90 điểm rèn luyện thì xếp loại gì?"</w:t>
+      </w:r>
+      <w:r>
+        <w:rPr>
+          <w:rFonts w:ascii="Times New Roman" w:hAnsi="Times New Roman" w:eastAsia="Times New Roman" w:cs="Times New Roman"/>
+          <w:color w:val="auto"/>
+        </w:rPr>
+        <w:t>): agent trả lời 1 bước “Tốt … điểm xuất sắc yêu cầu từ 92 điểm trở lên (doc_id: DOC0008, Điều 10)” và ghi chú “nếu hỏi về quy định cũ năm 2021, 90 điểm sẽ là loại Xuất sắc”.</w:t>
       </w:r>
     </w:p>
     <w:p>
@@ -6582,16 +6677,7 @@
             <w:insideH w:val="single" w:color="auto" w:sz="4" w:space="0"/>
             <w:insideV w:val="single" w:color="auto" w:sz="4" w:space="0"/>
           </w:tblBorders>
-          <w:tblCellMar>
-            <w:top w:w="0" w:type="dxa"/>
-            <w:left w:w="10" w:type="dxa"/>
-            <w:bottom w:w="0" w:type="dxa"/>
-            <w:right w:w="10" w:type="dxa"/>
-          </w:tblCellMar>
         </w:tblPrEx>
-        <w:trPr>
-          <w:tblHeader/>
-        </w:trPr>
         <w:tc>
           <w:tcPr>
             <w:tcW w:w="2300" w:type="dxa"/>
@@ -6601,13 +6687,51 @@
               <w:bottom w:val="single" w:color="8C8C8C" w:sz="4" w:space="0"/>
               <w:right w:val="single" w:color="8C8C8C" w:sz="4" w:space="0"/>
             </w:tcBorders>
-            <w:shd w:val="clear" w:color="auto" w:fill="D9E2F3"/>
-            <w:tcMar>
-              <w:top w:w="50" w:type="dxa"/>
-              <w:left w:w="90" w:type="dxa"/>
-              <w:bottom w:w="50" w:type="dxa"/>
-              <w:right w:w="90" w:type="dxa"/>
-            </w:tcMar>
+            <w:tcMar>
+              <w:top w:w="50" w:type="dxa"/>
+              <w:left w:w="90" w:type="dxa"/>
+              <w:bottom w:w="50" w:type="dxa"/>
+              <w:right w:w="90" w:type="dxa"/>
+            </w:tcMar>
+          </w:tcPr>
+          <w:p>
+            <w:pPr>
+              <w:spacing w:after="0" w:line="252" w:lineRule="auto"/>
+              <w:jc w:val="left"/>
+              <w:rPr>
+                <w:rFonts w:hint="default"/>
+                <w:color w:val="auto"/>
+                <w:lang w:val="en-US"/>
+              </w:rPr>
+            </w:pPr>
+            <w:r>
+              <w:rPr>
+                <w:rFonts w:hint="default" w:cs="Times New Roman"/>
+                <w:color w:val="auto"/>
+                <w:sz w:val="20"/>
+                <w:szCs w:val="20"/>
+                <w:lang w:val="en-US"/>
+              </w:rPr>
+              <w:t>Tool</w:t>
+            </w:r>
+          </w:p>
+        </w:tc>
+        <w:tc>
+          <w:tcPr>
+            <w:tcW w:w="2700" w:type="dxa"/>
+            <w:tcBorders>
+              <w:top w:val="single" w:color="8C8C8C" w:sz="4" w:space="0"/>
+              <w:left w:val="single" w:color="8C8C8C" w:sz="4" w:space="0"/>
+              <w:bottom w:val="single" w:color="8C8C8C" w:sz="4" w:space="0"/>
+              <w:right w:val="single" w:color="8C8C8C" w:sz="4" w:space="0"/>
+            </w:tcBorders>
+            <w:tcMar>
+              <w:top w:w="50" w:type="dxa"/>
+              <w:left w:w="90" w:type="dxa"/>
+              <w:bottom w:w="50" w:type="dxa"/>
+              <w:right w:w="90" w:type="dxa"/>
+            </w:tcMar>
+            <w:vAlign w:val="top"/>
           </w:tcPr>
           <w:p>
             <w:pPr>
@@ -6626,26 +6750,26 @@
                 <w:sz w:val="20"/>
                 <w:szCs w:val="20"/>
               </w:rPr>
-              <w:t>Tool</w:t>
-            </w:r>
-          </w:p>
-        </w:tc>
-        <w:tc>
-          <w:tcPr>
-            <w:tcW w:w="2700" w:type="dxa"/>
-            <w:tcBorders>
-              <w:top w:val="single" w:color="8C8C8C" w:sz="4" w:space="0"/>
-              <w:left w:val="single" w:color="8C8C8C" w:sz="4" w:space="0"/>
-              <w:bottom w:val="single" w:color="8C8C8C" w:sz="4" w:space="0"/>
-              <w:right w:val="single" w:color="8C8C8C" w:sz="4" w:space="0"/>
-            </w:tcBorders>
-            <w:shd w:val="clear" w:color="auto" w:fill="D9E2F3"/>
-            <w:tcMar>
-              <w:top w:w="50" w:type="dxa"/>
-              <w:left w:w="90" w:type="dxa"/>
-              <w:bottom w:w="50" w:type="dxa"/>
-              <w:right w:w="90" w:type="dxa"/>
-            </w:tcMar>
+              <w:t>Input (JSON Schema)</w:t>
+            </w:r>
+          </w:p>
+        </w:tc>
+        <w:tc>
+          <w:tcPr>
+            <w:tcW w:w="3638" w:type="dxa"/>
+            <w:tcBorders>
+              <w:top w:val="single" w:color="8C8C8C" w:sz="4" w:space="0"/>
+              <w:left w:val="single" w:color="8C8C8C" w:sz="4" w:space="0"/>
+              <w:bottom w:val="single" w:color="8C8C8C" w:sz="4" w:space="0"/>
+              <w:right w:val="single" w:color="8C8C8C" w:sz="4" w:space="0"/>
+            </w:tcBorders>
+            <w:tcMar>
+              <w:top w:w="50" w:type="dxa"/>
+              <w:left w:w="90" w:type="dxa"/>
+              <w:bottom w:w="50" w:type="dxa"/>
+              <w:right w:w="90" w:type="dxa"/>
+            </w:tcMar>
+            <w:vAlign w:val="top"/>
           </w:tcPr>
           <w:p>
             <w:pPr>
@@ -6664,20 +6788,19 @@
                 <w:sz w:val="20"/>
                 <w:szCs w:val="20"/>
               </w:rPr>
-              <w:t>Input (JSON Schema)</w:t>
-            </w:r>
-          </w:p>
-        </w:tc>
-        <w:tc>
-          <w:tcPr>
-            <w:tcW w:w="3638" w:type="dxa"/>
-            <w:tcBorders>
-              <w:top w:val="single" w:color="8C8C8C" w:sz="4" w:space="0"/>
-              <w:left w:val="single" w:color="8C8C8C" w:sz="4" w:space="0"/>
-              <w:bottom w:val="single" w:color="8C8C8C" w:sz="4" w:space="0"/>
-              <w:right w:val="single" w:color="8C8C8C" w:sz="4" w:space="0"/>
-            </w:tcBorders>
-            <w:shd w:val="clear" w:color="auto" w:fill="D9E2F3"/>
+              <w:t>Output (chuỗi JSON / văn bản)</w:t>
+            </w:r>
+          </w:p>
+        </w:tc>
+        <w:tc>
+          <w:tcPr>
+            <w:tcW w:w="1000" w:type="dxa"/>
+            <w:tcBorders>
+              <w:top w:val="single" w:color="8C8C8C" w:sz="4" w:space="0"/>
+              <w:left w:val="single" w:color="8C8C8C" w:sz="4" w:space="0"/>
+              <w:bottom w:val="single" w:color="8C8C8C" w:sz="4" w:space="0"/>
+              <w:right w:val="single" w:color="8C8C8C" w:sz="4" w:space="0"/>
+            </w:tcBorders>
             <w:tcMar>
               <w:top w:w="50" w:type="dxa"/>
               <w:left w:w="90" w:type="dxa"/>
@@ -6702,45 +6825,7 @@
                 <w:sz w:val="20"/>
                 <w:szCs w:val="20"/>
               </w:rPr>
-              <w:t>Output (chuỗi JSON / văn bản)</w:t>
-            </w:r>
-          </w:p>
-        </w:tc>
-        <w:tc>
-          <w:tcPr>
-            <w:tcW w:w="1000" w:type="dxa"/>
-            <w:tcBorders>
-              <w:top w:val="single" w:color="8C8C8C" w:sz="4" w:space="0"/>
-              <w:left w:val="single" w:color="8C8C8C" w:sz="4" w:space="0"/>
-              <w:bottom w:val="single" w:color="8C8C8C" w:sz="4" w:space="0"/>
-              <w:right w:val="single" w:color="8C8C8C" w:sz="4" w:space="0"/>
-            </w:tcBorders>
-            <w:shd w:val="clear" w:color="auto" w:fill="D9E2F3"/>
-            <w:tcMar>
-              <w:top w:w="50" w:type="dxa"/>
-              <w:left w:w="90" w:type="dxa"/>
-              <w:bottom w:w="50" w:type="dxa"/>
-              <w:right w:w="90" w:type="dxa"/>
-            </w:tcMar>
-          </w:tcPr>
-          <w:p>
-            <w:pPr>
-              <w:spacing w:after="0" w:line="252" w:lineRule="auto"/>
-              <w:jc w:val="left"/>
-              <w:rPr>
-                <w:color w:val="auto"/>
-              </w:rPr>
-            </w:pPr>
-            <w:r>
-              <w:rPr>
-                <w:rFonts w:ascii="Times New Roman" w:hAnsi="Times New Roman" w:eastAsia="Times New Roman" w:cs="Times New Roman"/>
-                <w:b/>
-                <w:bCs/>
-                <w:color w:val="auto"/>
-                <w:sz w:val="20"/>
-                <w:szCs w:val="20"/>
-              </w:rPr>
-              <w:t>Ghi?</w:t>
+              <w:t>Ghi</w:t>
             </w:r>
           </w:p>
         </w:tc>
@@ -7111,6 +7196,7 @@
               <w:bottom w:w="50" w:type="dxa"/>
               <w:right w:w="90" w:type="dxa"/>
             </w:tcMar>
+            <w:vAlign w:val="top"/>
           </w:tcPr>
           <w:p>
             <w:pPr>
@@ -7146,6 +7232,7 @@
               <w:bottom w:w="50" w:type="dxa"/>
               <w:right w:w="90" w:type="dxa"/>
             </w:tcMar>
+            <w:vAlign w:val="top"/>
           </w:tcPr>
           <w:p>
             <w:pPr>
@@ -7181,6 +7268,7 @@
               <w:bottom w:w="50" w:type="dxa"/>
               <w:right w:w="90" w:type="dxa"/>
             </w:tcMar>
+            <w:vAlign w:val="top"/>
           </w:tcPr>
           <w:p>
             <w:pPr>
@@ -7216,6 +7304,7 @@
               <w:bottom w:w="50" w:type="dxa"/>
               <w:right w:w="90" w:type="dxa"/>
             </w:tcMar>
+            <w:vAlign w:val="top"/>
           </w:tcPr>
           <w:p>
             <w:pPr>
@@ -7269,6 +7358,7 @@
               <w:bottom w:w="50" w:type="dxa"/>
               <w:right w:w="90" w:type="dxa"/>
             </w:tcMar>
+            <w:vAlign w:val="top"/>
           </w:tcPr>
           <w:p>
             <w:pPr>
@@ -7304,6 +7394,7 @@
               <w:bottom w:w="50" w:type="dxa"/>
               <w:right w:w="90" w:type="dxa"/>
             </w:tcMar>
+            <w:vAlign w:val="top"/>
           </w:tcPr>
           <w:p>
             <w:pPr>
@@ -7339,6 +7430,7 @@
               <w:bottom w:w="50" w:type="dxa"/>
               <w:right w:w="90" w:type="dxa"/>
             </w:tcMar>
+            <w:vAlign w:val="top"/>
           </w:tcPr>
           <w:p>
             <w:pPr>
@@ -7368,19 +7460,24 @@
               <w:bottom w:val="single" w:color="8C8C8C" w:sz="4" w:space="0"/>
               <w:right w:val="single" w:color="8C8C8C" w:sz="4" w:space="0"/>
             </w:tcBorders>
-            <w:tcMar>
-              <w:top w:w="50" w:type="dxa"/>
-              <w:left w:w="90" w:type="dxa"/>
-              <w:bottom w:w="50" w:type="dxa"/>
-              <w:right w:w="90" w:type="dxa"/>
-            </w:tcMar>
-          </w:tcPr>
-          <w:p>
-            <w:pPr>
-              <w:spacing w:after="0" w:line="252" w:lineRule="auto"/>
-              <w:jc w:val="left"/>
-              <w:rPr>
-                <w:color w:val="auto"/>
+            <w:shd w:val="clear"/>
+            <w:tcMar>
+              <w:top w:w="50" w:type="dxa"/>
+              <w:left w:w="90" w:type="dxa"/>
+              <w:bottom w:w="50" w:type="dxa"/>
+              <w:right w:w="90" w:type="dxa"/>
+            </w:tcMar>
+            <w:vAlign w:val="top"/>
+          </w:tcPr>
+          <w:p>
+            <w:pPr>
+              <w:spacing w:after="0" w:line="252" w:lineRule="auto"/>
+              <w:jc w:val="left"/>
+              <w:rPr>
+                <w:rFonts w:ascii="Times New Roman" w:hAnsi="Times New Roman" w:eastAsia="Times New Roman" w:cs="Times New Roman"/>
+                <w:color w:val="auto"/>
+                <w:sz w:val="24"/>
+                <w:szCs w:val="24"/>
               </w:rPr>
             </w:pPr>
             <w:r>
@@ -7433,77 +7530,52 @@
               <w:spacing w:after="0" w:line="252" w:lineRule="auto"/>
               <w:jc w:val="left"/>
               <w:rPr>
-                <w:color w:val="auto"/>
-              </w:rPr>
-            </w:pPr>
-            <w:r>
-              <w:rPr>
-                <w:rFonts w:ascii="Times New Roman" w:hAnsi="Times New Roman" w:eastAsia="Times New Roman" w:cs="Times New Roman"/>
+                <w:rFonts w:hint="default" w:ascii="Times New Roman" w:hAnsi="Times New Roman" w:eastAsia="Times New Roman" w:cs="Times New Roman"/>
                 <w:color w:val="auto"/>
                 <w:sz w:val="20"/>
                 <w:szCs w:val="20"/>
-              </w:rPr>
-              <w:t>get_complaint</w:t>
-            </w:r>
-          </w:p>
-        </w:tc>
-        <w:tc>
-          <w:tcPr>
-            <w:tcW w:w="2700" w:type="dxa"/>
-            <w:tcBorders>
-              <w:top w:val="single" w:color="8C8C8C" w:sz="4" w:space="0"/>
-              <w:left w:val="single" w:color="8C8C8C" w:sz="4" w:space="0"/>
-              <w:bottom w:val="single" w:color="8C8C8C" w:sz="4" w:space="0"/>
-              <w:right w:val="single" w:color="8C8C8C" w:sz="4" w:space="0"/>
-            </w:tcBorders>
-            <w:tcMar>
-              <w:top w:w="50" w:type="dxa"/>
-              <w:left w:w="90" w:type="dxa"/>
-              <w:bottom w:w="50" w:type="dxa"/>
-              <w:right w:w="90" w:type="dxa"/>
-            </w:tcMar>
-          </w:tcPr>
-          <w:p>
-            <w:pPr>
-              <w:spacing w:after="0" w:line="252" w:lineRule="auto"/>
-              <w:jc w:val="left"/>
-              <w:rPr>
-                <w:color w:val="auto"/>
-              </w:rPr>
-            </w:pPr>
-            <w:r>
-              <w:rPr>
-                <w:rFonts w:ascii="Times New Roman" w:hAnsi="Times New Roman" w:eastAsia="Times New Roman" w:cs="Times New Roman"/>
+                <w:lang w:val="en-US"/>
+              </w:rPr>
+            </w:pPr>
+            <w:r>
+              <w:rPr>
+                <w:rFonts w:hint="default" w:cs="Times New Roman"/>
                 <w:color w:val="auto"/>
                 <w:sz w:val="20"/>
                 <w:szCs w:val="20"/>
-              </w:rPr>
-              <w:t>complaint_id: string</w:t>
-            </w:r>
-          </w:p>
-        </w:tc>
-        <w:tc>
-          <w:tcPr>
-            <w:tcW w:w="3638" w:type="dxa"/>
-            <w:tcBorders>
-              <w:top w:val="single" w:color="8C8C8C" w:sz="4" w:space="0"/>
-              <w:left w:val="single" w:color="8C8C8C" w:sz="4" w:space="0"/>
-              <w:bottom w:val="single" w:color="8C8C8C" w:sz="4" w:space="0"/>
-              <w:right w:val="single" w:color="8C8C8C" w:sz="4" w:space="0"/>
-            </w:tcBorders>
-            <w:tcMar>
-              <w:top w:w="50" w:type="dxa"/>
-              <w:left w:w="90" w:type="dxa"/>
-              <w:bottom w:w="50" w:type="dxa"/>
-              <w:right w:w="90" w:type="dxa"/>
-            </w:tcMar>
-          </w:tcPr>
-          <w:p>
-            <w:pPr>
-              <w:spacing w:after="0" w:line="252" w:lineRule="auto"/>
-              <w:jc w:val="left"/>
-              <w:rPr>
-                <w:color w:val="auto"/>
+                <w:lang w:val="en-US"/>
+              </w:rPr>
+              <w:t>get_complaint</w:t>
+            </w:r>
+          </w:p>
+        </w:tc>
+        <w:tc>
+          <w:tcPr>
+            <w:tcW w:w="2700" w:type="dxa"/>
+            <w:tcBorders>
+              <w:top w:val="single" w:color="8C8C8C" w:sz="4" w:space="0"/>
+              <w:left w:val="single" w:color="8C8C8C" w:sz="4" w:space="0"/>
+              <w:bottom w:val="single" w:color="8C8C8C" w:sz="4" w:space="0"/>
+              <w:right w:val="single" w:color="8C8C8C" w:sz="4" w:space="0"/>
+            </w:tcBorders>
+            <w:shd w:val="clear"/>
+            <w:tcMar>
+              <w:top w:w="50" w:type="dxa"/>
+              <w:left w:w="90" w:type="dxa"/>
+              <w:bottom w:w="50" w:type="dxa"/>
+              <w:right w:w="90" w:type="dxa"/>
+            </w:tcMar>
+            <w:vAlign w:val="top"/>
+          </w:tcPr>
+          <w:p>
+            <w:pPr>
+              <w:spacing w:after="0" w:line="252" w:lineRule="auto"/>
+              <w:jc w:val="left"/>
+              <w:rPr>
+                <w:rFonts w:ascii="Times New Roman" w:hAnsi="Times New Roman" w:eastAsia="Times New Roman" w:cs="Times New Roman"/>
+                <w:color w:val="auto"/>
+                <w:sz w:val="24"/>
+                <w:szCs w:val="24"/>
               </w:rPr>
             </w:pPr>
             <w:r>
@@ -7513,32 +7585,37 @@
                 <w:sz w:val="20"/>
                 <w:szCs w:val="20"/>
               </w:rPr>
-              <w:t>found + toàn bộ đơn, hoặc found = false</w:t>
-            </w:r>
-          </w:p>
-        </w:tc>
-        <w:tc>
-          <w:tcPr>
-            <w:tcW w:w="1000" w:type="dxa"/>
-            <w:tcBorders>
-              <w:top w:val="single" w:color="8C8C8C" w:sz="4" w:space="0"/>
-              <w:left w:val="single" w:color="8C8C8C" w:sz="4" w:space="0"/>
-              <w:bottom w:val="single" w:color="8C8C8C" w:sz="4" w:space="0"/>
-              <w:right w:val="single" w:color="8C8C8C" w:sz="4" w:space="0"/>
-            </w:tcBorders>
-            <w:tcMar>
-              <w:top w:w="50" w:type="dxa"/>
-              <w:left w:w="90" w:type="dxa"/>
-              <w:bottom w:w="50" w:type="dxa"/>
-              <w:right w:w="90" w:type="dxa"/>
-            </w:tcMar>
-          </w:tcPr>
-          <w:p>
-            <w:pPr>
-              <w:spacing w:after="0" w:line="252" w:lineRule="auto"/>
-              <w:jc w:val="left"/>
-              <w:rPr>
-                <w:color w:val="auto"/>
+              <w:t>complaint_id: string</w:t>
+            </w:r>
+          </w:p>
+        </w:tc>
+        <w:tc>
+          <w:tcPr>
+            <w:tcW w:w="3638" w:type="dxa"/>
+            <w:tcBorders>
+              <w:top w:val="single" w:color="8C8C8C" w:sz="4" w:space="0"/>
+              <w:left w:val="single" w:color="8C8C8C" w:sz="4" w:space="0"/>
+              <w:bottom w:val="single" w:color="8C8C8C" w:sz="4" w:space="0"/>
+              <w:right w:val="single" w:color="8C8C8C" w:sz="4" w:space="0"/>
+            </w:tcBorders>
+            <w:shd w:val="clear"/>
+            <w:tcMar>
+              <w:top w:w="50" w:type="dxa"/>
+              <w:left w:w="90" w:type="dxa"/>
+              <w:bottom w:w="50" w:type="dxa"/>
+              <w:right w:w="90" w:type="dxa"/>
+            </w:tcMar>
+            <w:vAlign w:val="top"/>
+          </w:tcPr>
+          <w:p>
+            <w:pPr>
+              <w:spacing w:after="0" w:line="252" w:lineRule="auto"/>
+              <w:jc w:val="left"/>
+              <w:rPr>
+                <w:rFonts w:ascii="Times New Roman" w:hAnsi="Times New Roman" w:eastAsia="Times New Roman" w:cs="Times New Roman"/>
+                <w:color w:val="auto"/>
+                <w:sz w:val="24"/>
+                <w:szCs w:val="24"/>
               </w:rPr>
             </w:pPr>
             <w:r>
@@ -7548,6 +7625,44 @@
                 <w:sz w:val="20"/>
                 <w:szCs w:val="20"/>
               </w:rPr>
+              <w:t>found + toàn bộ đơn, hoặc found = false</w:t>
+            </w:r>
+          </w:p>
+        </w:tc>
+        <w:tc>
+          <w:tcPr>
+            <w:tcW w:w="1000" w:type="dxa"/>
+            <w:tcBorders>
+              <w:top w:val="single" w:color="8C8C8C" w:sz="4" w:space="0"/>
+              <w:left w:val="single" w:color="8C8C8C" w:sz="4" w:space="0"/>
+              <w:bottom w:val="single" w:color="8C8C8C" w:sz="4" w:space="0"/>
+              <w:right w:val="single" w:color="8C8C8C" w:sz="4" w:space="0"/>
+            </w:tcBorders>
+            <w:tcMar>
+              <w:top w:w="50" w:type="dxa"/>
+              <w:left w:w="90" w:type="dxa"/>
+              <w:bottom w:w="50" w:type="dxa"/>
+              <w:right w:w="90" w:type="dxa"/>
+            </w:tcMar>
+          </w:tcPr>
+          <w:p>
+            <w:pPr>
+              <w:spacing w:after="0" w:line="252" w:lineRule="auto"/>
+              <w:jc w:val="left"/>
+              <w:rPr>
+                <w:rFonts w:ascii="Times New Roman" w:hAnsi="Times New Roman" w:eastAsia="Times New Roman" w:cs="Times New Roman"/>
+                <w:color w:val="auto"/>
+                <w:sz w:val="20"/>
+                <w:szCs w:val="20"/>
+              </w:rPr>
+            </w:pPr>
+            <w:r>
+              <w:rPr>
+                <w:rFonts w:ascii="Times New Roman" w:hAnsi="Times New Roman" w:eastAsia="Times New Roman" w:cs="Times New Roman"/>
+                <w:color w:val="auto"/>
+                <w:sz w:val="20"/>
+                <w:szCs w:val="20"/>
+              </w:rPr>
               <w:t>Không</w:t>
             </w:r>
           </w:p>
@@ -7559,25 +7674,21 @@
         <w:spacing w:before="80" w:after="100" w:line="276" w:lineRule="auto"/>
         <w:jc w:val="both"/>
         <w:rPr>
-          <w:color w:val="auto"/>
-        </w:rPr>
-      </w:pPr>
-      <w:r>
-        <w:rPr>
           <w:rFonts w:ascii="Consolas" w:hAnsi="Consolas" w:eastAsia="Consolas" w:cs="Consolas"/>
           <w:color w:val="auto"/>
           <w:sz w:val="21"/>
           <w:szCs w:val="21"/>
         </w:rPr>
-        <w:t xml:space="preserve">calculate_training_score</w:t>
-      </w:r>
-      <w:r>
-        <w:rPr>
-          <w:rFonts w:ascii="Times New Roman" w:hAnsi="Times New Roman" w:eastAsia="Times New Roman" w:cs="Times New Roman"/>
-          <w:color w:val="auto"/>
-        </w:rPr>
-        <w:t xml:space="preserve"> tính bằng code: mỗi nội dung = base + bonus − penalty, chặn trong khung điểm tối đa của nội dung đó, tổng không quá 100, xếp loại theo các mốc 92/82/68/50/35 của bản 2024 (bản đang áp dụng; trước khi có bản 2024 tool dùng mốc 90/80/65 của bản 2021). Mọi lỗi trong tool được bắt và trả về </w:t>
-      </w:r>
+      </w:pPr>
+    </w:p>
+    <w:p>
+      <w:pPr>
+        <w:spacing w:before="80" w:after="100" w:line="276" w:lineRule="auto"/>
+        <w:jc w:val="both"/>
+        <w:rPr>
+          <w:color w:val="auto"/>
+        </w:rPr>
+      </w:pPr>
       <w:r>
         <w:rPr>
           <w:rFonts w:ascii="Consolas" w:hAnsi="Consolas" w:eastAsia="Consolas" w:cs="Consolas"/>
@@ -7585,14 +7696,30 @@
           <w:sz w:val="21"/>
           <w:szCs w:val="21"/>
         </w:rPr>
-        <w:t xml:space="preserve">CallToolResult(isError=True, text="Error: ...")</w:t>
-      </w:r>
-      <w:r>
-        <w:rPr>
-          <w:rFonts w:ascii="Times New Roman" w:hAnsi="Times New Roman" w:eastAsia="Times New Roman" w:cs="Times New Roman"/>
-          <w:color w:val="auto"/>
-        </w:rPr>
-        <w:t xml:space="preserve">.</w:t>
+        <w:t>calculate_training_score</w:t>
+      </w:r>
+      <w:r>
+        <w:rPr>
+          <w:rFonts w:ascii="Times New Roman" w:hAnsi="Times New Roman" w:eastAsia="Times New Roman" w:cs="Times New Roman"/>
+          <w:color w:val="auto"/>
+        </w:rPr>
+        <w:t xml:space="preserve"> tính bằng code: mỗi nội dung = base + bonus − penalty, chặn trong khung điểm tối đa của nội dung đó, tổng không quá 100, xếp loại theo các mốc 92/82/68/50/35 của bản 2024 (bản đang áp dụng; trước khi có bản 2024 tool dùng mốc 90/80/65 của bản 2021). Mọi lỗi trong tool được bắt và trả về </w:t>
+      </w:r>
+      <w:r>
+        <w:rPr>
+          <w:rFonts w:ascii="Consolas" w:hAnsi="Consolas" w:eastAsia="Consolas" w:cs="Consolas"/>
+          <w:color w:val="auto"/>
+          <w:sz w:val="21"/>
+          <w:szCs w:val="21"/>
+        </w:rPr>
+        <w:t>CallToolResult(isError=True, text="Error: ...")</w:t>
+      </w:r>
+      <w:r>
+        <w:rPr>
+          <w:rFonts w:ascii="Times New Roman" w:hAnsi="Times New Roman" w:eastAsia="Times New Roman" w:cs="Times New Roman"/>
+          <w:color w:val="auto"/>
+        </w:rPr>
+        <w:t>.</w:t>
       </w:r>
     </w:p>
     <w:p>
@@ -7955,7 +8082,7 @@
           <w:sz w:val="21"/>
           <w:szCs w:val="21"/>
         </w:rPr>
-        <w:t xml:space="preserve">tests/testset.jsonl</w:t>
+        <w:t>tests/testset.jsonl</w:t>
       </w:r>
       <w:r>
         <w:rPr>
@@ -7971,7 +8098,7 @@
           <w:bCs/>
           <w:color w:val="auto"/>
         </w:rPr>
-        <w:t xml:space="preserve">21 câu</w:t>
+        <w:t>21 câu</w:t>
       </w:r>
       <w:r>
         <w:rPr>
@@ -7987,7 +8114,7 @@
           <w:sz w:val="21"/>
           <w:szCs w:val="21"/>
         </w:rPr>
-        <w:t xml:space="preserve">question</w:t>
+        <w:t>question</w:t>
       </w:r>
       <w:r>
         <w:rPr>
@@ -8003,7 +8130,7 @@
           <w:sz w:val="21"/>
           <w:szCs w:val="21"/>
         </w:rPr>
-        <w:t xml:space="preserve">expected_answer</w:t>
+        <w:t>expected_answer</w:t>
       </w:r>
       <w:r>
         <w:rPr>
@@ -8019,7 +8146,7 @@
           <w:sz w:val="21"/>
           <w:szCs w:val="21"/>
         </w:rPr>
-        <w:t xml:space="preserve">is_answerable</w:t>
+        <w:t>is_answerable</w:t>
       </w:r>
       <w:r>
         <w:rPr>
@@ -8035,7 +8162,7 @@
           <w:sz w:val="21"/>
           <w:szCs w:val="21"/>
         </w:rPr>
-        <w:t xml:space="preserve">expected_doc</w:t>
+        <w:t>expected_doc</w:t>
       </w:r>
       <w:r>
         <w:rPr>
@@ -8081,16 +8208,7 @@
             <w:insideH w:val="single" w:color="auto" w:sz="4" w:space="0"/>
             <w:insideV w:val="single" w:color="auto" w:sz="4" w:space="0"/>
           </w:tblBorders>
-          <w:tblCellMar>
-            <w:top w:w="0" w:type="dxa"/>
-            <w:left w:w="10" w:type="dxa"/>
-            <w:bottom w:w="0" w:type="dxa"/>
-            <w:right w:w="10" w:type="dxa"/>
-          </w:tblCellMar>
         </w:tblPrEx>
-        <w:trPr>
-          <w:tblHeader/>
-        </w:trPr>
         <w:tc>
           <w:tcPr>
             <w:tcW w:w="5400" w:type="dxa"/>
@@ -8100,20 +8218,22 @@
               <w:bottom w:val="single" w:color="8C8C8C" w:sz="4" w:space="0"/>
               <w:right w:val="single" w:color="8C8C8C" w:sz="4" w:space="0"/>
             </w:tcBorders>
-            <w:shd w:val="clear" w:color="auto" w:fill="D9E2F3"/>
-            <w:tcMar>
-              <w:top w:w="50" w:type="dxa"/>
-              <w:left w:w="90" w:type="dxa"/>
-              <w:bottom w:w="50" w:type="dxa"/>
-              <w:right w:w="90" w:type="dxa"/>
-            </w:tcMar>
-          </w:tcPr>
-          <w:p>
-            <w:pPr>
-              <w:spacing w:after="0" w:line="252" w:lineRule="auto"/>
-              <w:jc w:val="left"/>
-              <w:rPr>
-                <w:color w:val="auto"/>
+            <w:tcMar>
+              <w:top w:w="50" w:type="dxa"/>
+              <w:left w:w="90" w:type="dxa"/>
+              <w:bottom w:w="50" w:type="dxa"/>
+              <w:right w:w="90" w:type="dxa"/>
+            </w:tcMar>
+            <w:vAlign w:val="top"/>
+          </w:tcPr>
+          <w:p>
+            <w:pPr>
+              <w:spacing w:after="0" w:line="252" w:lineRule="auto"/>
+              <w:jc w:val="left"/>
+              <w:rPr>
+                <w:rFonts w:hint="default"/>
+                <w:color w:val="auto"/>
+                <w:lang w:val="en-US"/>
               </w:rPr>
             </w:pPr>
             <w:r>
@@ -8138,13 +8258,13 @@
               <w:bottom w:val="single" w:color="8C8C8C" w:sz="4" w:space="0"/>
               <w:right w:val="single" w:color="8C8C8C" w:sz="4" w:space="0"/>
             </w:tcBorders>
-            <w:shd w:val="clear" w:color="auto" w:fill="D9E2F3"/>
-            <w:tcMar>
-              <w:top w:w="50" w:type="dxa"/>
-              <w:left w:w="90" w:type="dxa"/>
-              <w:bottom w:w="50" w:type="dxa"/>
-              <w:right w:w="90" w:type="dxa"/>
-            </w:tcMar>
+            <w:tcMar>
+              <w:top w:w="50" w:type="dxa"/>
+              <w:left w:w="90" w:type="dxa"/>
+              <w:bottom w:w="50" w:type="dxa"/>
+              <w:right w:w="90" w:type="dxa"/>
+            </w:tcMar>
+            <w:vAlign w:val="top"/>
           </w:tcPr>
           <w:p>
             <w:pPr>
@@ -8176,13 +8296,13 @@
               <w:bottom w:val="single" w:color="8C8C8C" w:sz="4" w:space="0"/>
               <w:right w:val="single" w:color="8C8C8C" w:sz="4" w:space="0"/>
             </w:tcBorders>
-            <w:shd w:val="clear" w:color="auto" w:fill="D9E2F3"/>
-            <w:tcMar>
-              <w:top w:w="50" w:type="dxa"/>
-              <w:left w:w="90" w:type="dxa"/>
-              <w:bottom w:w="50" w:type="dxa"/>
-              <w:right w:w="90" w:type="dxa"/>
-            </w:tcMar>
+            <w:tcMar>
+              <w:top w:w="50" w:type="dxa"/>
+              <w:left w:w="90" w:type="dxa"/>
+              <w:bottom w:w="50" w:type="dxa"/>
+              <w:right w:w="90" w:type="dxa"/>
+            </w:tcMar>
+            <w:vAlign w:val="top"/>
           </w:tcPr>
           <w:p>
             <w:pPr>
@@ -9209,7 +9329,7 @@
     </w:p>
     <w:p>
       <w:pPr>
-        <w:pStyle w:val="18"/>
+        <w:pStyle w:val="19"/>
         <w:numPr>
           <w:ilvl w:val="0"/>
           <w:numId w:val="1"/>
@@ -9239,7 +9359,7 @@
     </w:p>
     <w:p>
       <w:pPr>
-        <w:pStyle w:val="18"/>
+        <w:pStyle w:val="19"/>
         <w:numPr>
           <w:ilvl w:val="0"/>
           <w:numId w:val="1"/>
@@ -9285,7 +9405,7 @@
     </w:p>
     <w:p>
       <w:pPr>
-        <w:pStyle w:val="18"/>
+        <w:pStyle w:val="19"/>
         <w:numPr>
           <w:ilvl w:val="0"/>
           <w:numId w:val="1"/>
@@ -9331,7 +9451,7 @@
     </w:p>
     <w:p>
       <w:pPr>
-        <w:pStyle w:val="18"/>
+        <w:pStyle w:val="19"/>
         <w:numPr>
           <w:ilvl w:val="0"/>
           <w:numId w:val="1"/>
@@ -9349,7 +9469,7 @@
           <w:bCs/>
           <w:color w:val="auto"/>
         </w:rPr>
-        <w:t xml:space="preserve">Đúng phiên bản</w:t>
+        <w:t>Đúng phiên bản</w:t>
       </w:r>
       <w:r>
         <w:rPr>
@@ -9365,7 +9485,7 @@
           <w:sz w:val="21"/>
           <w:szCs w:val="21"/>
         </w:rPr>
-        <w:t xml:space="preserve">expected_doc</w:t>
+        <w:t>expected_doc</w:t>
       </w:r>
       <w:r>
         <w:rPr>
@@ -9377,7 +9497,7 @@
     </w:p>
     <w:p>
       <w:pPr>
-        <w:pStyle w:val="18"/>
+        <w:pStyle w:val="19"/>
         <w:numPr>
           <w:ilvl w:val="0"/>
           <w:numId w:val="1"/>
@@ -9521,9 +9641,6 @@
             <w:right w:w="10" w:type="dxa"/>
           </w:tblCellMar>
         </w:tblPrEx>
-        <w:trPr>
-          <w:tblHeader/>
-        </w:trPr>
         <w:tc>
           <w:tcPr>
             <w:tcW w:w="3276" w:type="dxa"/>
@@ -9533,13 +9650,13 @@
               <w:bottom w:val="single" w:color="8C8C8C" w:sz="4" w:space="0"/>
               <w:right w:val="single" w:color="8C8C8C" w:sz="4" w:space="0"/>
             </w:tcBorders>
-            <w:shd w:val="clear" w:color="auto" w:fill="D9E2F3"/>
-            <w:tcMar>
-              <w:top w:w="50" w:type="dxa"/>
-              <w:left w:w="90" w:type="dxa"/>
-              <w:bottom w:w="50" w:type="dxa"/>
-              <w:right w:w="90" w:type="dxa"/>
-            </w:tcMar>
+            <w:tcMar>
+              <w:top w:w="50" w:type="dxa"/>
+              <w:left w:w="90" w:type="dxa"/>
+              <w:bottom w:w="50" w:type="dxa"/>
+              <w:right w:w="90" w:type="dxa"/>
+            </w:tcMar>
+            <w:vAlign w:val="top"/>
           </w:tcPr>
           <w:p>
             <w:pPr>
@@ -9571,13 +9688,13 @@
               <w:bottom w:val="single" w:color="8C8C8C" w:sz="4" w:space="0"/>
               <w:right w:val="single" w:color="8C8C8C" w:sz="4" w:space="0"/>
             </w:tcBorders>
-            <w:shd w:val="clear" w:color="auto" w:fill="D9E2F3"/>
-            <w:tcMar>
-              <w:top w:w="50" w:type="dxa"/>
-              <w:left w:w="90" w:type="dxa"/>
-              <w:bottom w:w="50" w:type="dxa"/>
-              <w:right w:w="90" w:type="dxa"/>
-            </w:tcMar>
+            <w:tcMar>
+              <w:top w:w="50" w:type="dxa"/>
+              <w:left w:w="90" w:type="dxa"/>
+              <w:bottom w:w="50" w:type="dxa"/>
+              <w:right w:w="90" w:type="dxa"/>
+            </w:tcMar>
+            <w:vAlign w:val="top"/>
           </w:tcPr>
           <w:p>
             <w:pPr>
@@ -9609,13 +9726,13 @@
               <w:bottom w:val="single" w:color="8C8C8C" w:sz="4" w:space="0"/>
               <w:right w:val="single" w:color="8C8C8C" w:sz="4" w:space="0"/>
             </w:tcBorders>
-            <w:shd w:val="clear" w:color="auto" w:fill="D9E2F3"/>
-            <w:tcMar>
-              <w:top w:w="50" w:type="dxa"/>
-              <w:left w:w="90" w:type="dxa"/>
-              <w:bottom w:w="50" w:type="dxa"/>
-              <w:right w:w="90" w:type="dxa"/>
-            </w:tcMar>
+            <w:tcMar>
+              <w:top w:w="50" w:type="dxa"/>
+              <w:left w:w="90" w:type="dxa"/>
+              <w:bottom w:w="50" w:type="dxa"/>
+              <w:right w:w="90" w:type="dxa"/>
+            </w:tcMar>
+            <w:vAlign w:val="top"/>
           </w:tcPr>
           <w:p>
             <w:pPr>
@@ -9647,13 +9764,13 @@
               <w:bottom w:val="single" w:color="8C8C8C" w:sz="4" w:space="0"/>
               <w:right w:val="single" w:color="8C8C8C" w:sz="4" w:space="0"/>
             </w:tcBorders>
-            <w:shd w:val="clear" w:color="auto" w:fill="D9E2F3"/>
-            <w:tcMar>
-              <w:top w:w="50" w:type="dxa"/>
-              <w:left w:w="90" w:type="dxa"/>
-              <w:bottom w:w="50" w:type="dxa"/>
-              <w:right w:w="90" w:type="dxa"/>
-            </w:tcMar>
+            <w:tcMar>
+              <w:top w:w="50" w:type="dxa"/>
+              <w:left w:w="90" w:type="dxa"/>
+              <w:bottom w:w="50" w:type="dxa"/>
+              <w:right w:w="90" w:type="dxa"/>
+            </w:tcMar>
+            <w:vAlign w:val="top"/>
           </w:tcPr>
           <w:p>
             <w:pPr>
@@ -9685,13 +9802,13 @@
               <w:bottom w:val="single" w:color="8C8C8C" w:sz="4" w:space="0"/>
               <w:right w:val="single" w:color="8C8C8C" w:sz="4" w:space="0"/>
             </w:tcBorders>
-            <w:shd w:val="clear" w:color="auto" w:fill="D9E2F3"/>
-            <w:tcMar>
-              <w:top w:w="50" w:type="dxa"/>
-              <w:left w:w="90" w:type="dxa"/>
-              <w:bottom w:w="50" w:type="dxa"/>
-              <w:right w:w="90" w:type="dxa"/>
-            </w:tcMar>
+            <w:tcMar>
+              <w:top w:w="50" w:type="dxa"/>
+              <w:left w:w="90" w:type="dxa"/>
+              <w:bottom w:w="50" w:type="dxa"/>
+              <w:right w:w="90" w:type="dxa"/>
+            </w:tcMar>
+            <w:vAlign w:val="top"/>
           </w:tcPr>
           <w:p>
             <w:pPr>
@@ -10591,7 +10708,7 @@
           <w:bCs/>
           <w:color w:val="auto"/>
         </w:rPr>
-        <w:t xml:space="preserve">Nhận xét.</w:t>
+        <w:t>Nhận xét.</w:t>
       </w:r>
       <w:r>
         <w:rPr>
@@ -10607,7 +10724,7 @@
           <w:bCs/>
           <w:color w:val="auto"/>
         </w:rPr>
-        <w:t xml:space="preserve">Phân biệt phiên bản</w:t>
+        <w:t>Phân biệt phiên bản</w:t>
       </w:r>
       <w:r>
         <w:rPr>
@@ -10623,7 +10740,7 @@
           <w:bCs/>
           <w:color w:val="auto"/>
         </w:rPr>
-        <w:t xml:space="preserve">Faithfulness lần ①② thấp chủ yếu do cách chấm</w:t>
+        <w:t>Faithfulness lần ①② thấp chủ yếu do cách chấm</w:t>
       </w:r>
       <w:r>
         <w:rPr>
@@ -10639,7 +10756,7 @@
           <w:bCs/>
           <w:color w:val="auto"/>
         </w:rPr>
-        <w:t xml:space="preserve">hybrid, top_k = 5</w:t>
+        <w:t>hybrid, top_k = 5</w:t>
       </w:r>
       <w:r>
         <w:rPr>
@@ -10703,7 +10820,7 @@
           <w:sz w:val="21"/>
           <w:szCs w:val="21"/>
         </w:rPr>
-        <w:t xml:space="preserve">USAGE</w:t>
+        <w:t>USAGE</w:t>
       </w:r>
       <w:r>
         <w:rPr>
@@ -10719,7 +10836,7 @@
           <w:sz w:val="21"/>
           <w:szCs w:val="21"/>
         </w:rPr>
-        <w:t xml:space="preserve">logs/run_&lt;thời gian&gt;.jsonl</w:t>
+        <w:t>logs/run_&lt;thời gian&gt;.jsonl</w:t>
       </w:r>
       <w:r>
         <w:rPr>
@@ -10735,7 +10852,7 @@
           <w:bCs/>
           <w:color w:val="auto"/>
         </w:rPr>
-        <w:t xml:space="preserve">calls</w:t>
+        <w:t>calls</w:t>
       </w:r>
       <w:r>
         <w:rPr>
@@ -10751,7 +10868,7 @@
           <w:bCs/>
           <w:color w:val="auto"/>
         </w:rPr>
-        <w:t xml:space="preserve">prompt</w:t>
+        <w:t>prompt</w:t>
       </w:r>
       <w:r>
         <w:rPr>
@@ -10767,7 +10884,7 @@
           <w:bCs/>
           <w:color w:val="auto"/>
         </w:rPr>
-        <w:t xml:space="preserve">compl.</w:t>
+        <w:t>compl.</w:t>
       </w:r>
       <w:r>
         <w:rPr>
@@ -10790,7 +10907,7 @@
           <w:rFonts w:ascii="Times New Roman" w:hAnsi="Times New Roman" w:eastAsia="Times New Roman" w:cs="Times New Roman"/>
           <w:color w:val="auto"/>
         </w:rPr>
-        <w:t xml:space="preserve">Hybrid: 21 lần gọi LLM, 39.177 token đầu vào, 1.905 token đầu ra. Dense: 24 lần gọi LLM, 45.598 token đầu vào, 2.044 token đầu ra.</w:t>
+        <w:t>Hybrid: 21 lần gọi LLM, 39.177 token đầu vào, 1.905 token đầu ra. Dense: 24 lần gọi LLM, 45.598 token đầu vào, 2.044 token đầu ra.</w:t>
       </w:r>
     </w:p>
     <w:p>
@@ -10815,7 +10932,7 @@
           <w:bCs/>
           <w:color w:val="auto"/>
         </w:rPr>
-        <w:t xml:space="preserve">1 lần gọi LLM</w:t>
+        <w:t>1 lần gọi LLM</w:t>
       </w:r>
       <w:r>
         <w:rPr>
@@ -10856,7 +10973,7 @@
           <w:bCs/>
           <w:color w:val="auto"/>
         </w:rPr>
-        <w:t xml:space="preserve">Ca 1, lỗi ở khâu truy vấn khiến agent bịa: câu hỏi gõ không dấu.</w:t>
+        <w:t>Ca 1, lỗi ở khâu truy vấn khiến agent bịa: câu hỏi gõ không dấu.</w:t>
       </w:r>
       <w:r>
         <w:rPr>
@@ -10881,7 +10998,7 @@
           <w:bCs/>
           <w:color w:val="auto"/>
         </w:rPr>
-        <w:t xml:space="preserve">Ca 2, lỗi của cách đo, đã sửa: giám khảo không thấy phiên bản.</w:t>
+        <w:t>Ca 2, lỗi của cách đo, đã sửa: giám khảo không thấy phiên bản.</w:t>
       </w:r>
       <w:r>
         <w:rPr>
@@ -10897,7 +11014,7 @@
           <w:sz w:val="21"/>
           <w:szCs w:val="21"/>
         </w:rPr>
-        <w:t xml:space="preserve">judge_faithfulness</w:t>
+        <w:t>judge_faithfulness</w:t>
       </w:r>
       <w:r>
         <w:rPr>
@@ -10922,7 +11039,7 @@
           <w:bCs/>
           <w:color w:val="auto"/>
         </w:rPr>
-        <w:t xml:space="preserve">Ca 3, lỗi ở khâu suy luận (tầng b), chưa sửa: câu 14 “GPA 8.2, dự 2 buổi hội thảo cấp khoa, nghỉ học không phép 1 lần → điểm Học tập?”</w:t>
+        <w:t>Ca 3, lỗi ở khâu suy luận (tầng b), chưa sửa: câu 14 “GPA 8.2, dự 2 buổi hội thảo cấp khoa, nghỉ học không phép 1 lần → điểm Học tập?”</w:t>
       </w:r>
       <w:r>
         <w:rPr>
@@ -10938,7 +11055,7 @@
           <w:bCs/>
           <w:color w:val="auto"/>
         </w:rPr>
-        <w:t xml:space="preserve">Faithfulness chỉ đo “có bịa thông tin không”, không đo “có đúng, có đủ không”.</w:t>
+        <w:t>Faithfulness chỉ đo “có bịa thông tin không”, không đo “có đúng, có đủ không”.</w:t>
       </w:r>
     </w:p>
     <w:p>
@@ -10956,7 +11073,7 @@
           <w:bCs/>
           <w:color w:val="auto"/>
         </w:rPr>
-        <w:t xml:space="preserve">Ca 4, lỗi ở khâu truy vấn, chưa sửa: “mùa hè xanh” (câu 10).</w:t>
+        <w:t>Ca 4, lỗi ở khâu truy vấn, chưa sửa: “mùa hè xanh” (câu 10).</w:t>
       </w:r>
       <w:r>
         <w:rPr>
@@ -10981,7 +11098,7 @@
           <w:bCs/>
           <w:color w:val="auto"/>
         </w:rPr>
-        <w:t xml:space="preserve">Ca 5, lần nộp trước, đã sửa: “Sinh viên bị cảnh cáo thì xếp loại tối đa là gì?”</w:t>
+        <w:t>Ca 5, lần nộp trước, đã sửa: “Sinh viên bị cảnh cáo thì xếp loại tối đa là gì?”</w:t>
       </w:r>
       <w:r>
         <w:rPr>
@@ -11024,7 +11141,7 @@
     </w:p>
     <w:p>
       <w:pPr>
-        <w:pStyle w:val="18"/>
+        <w:pStyle w:val="19"/>
         <w:numPr>
           <w:ilvl w:val="0"/>
           <w:numId w:val="1"/>
@@ -11054,7 +11171,7 @@
     </w:p>
     <w:p>
       <w:pPr>
-        <w:pStyle w:val="18"/>
+        <w:pStyle w:val="19"/>
         <w:numPr>
           <w:ilvl w:val="0"/>
           <w:numId w:val="1"/>
@@ -11072,7 +11189,7 @@
           <w:bCs/>
           <w:color w:val="auto"/>
         </w:rPr>
-        <w:t xml:space="preserve">Xử lý phiên bản dựa vào prompt.</w:t>
+        <w:t>Xử lý phiên bản dựa vào prompt.</w:t>
       </w:r>
       <w:r>
         <w:rPr>
@@ -11088,7 +11205,7 @@
           <w:sz w:val="21"/>
           <w:szCs w:val="21"/>
         </w:rPr>
-        <w:t xml:space="preserve">version</w:t>
+        <w:t>version</w:t>
       </w:r>
       <w:r>
         <w:rPr>
@@ -11100,7 +11217,7 @@
     </w:p>
     <w:p>
       <w:pPr>
-        <w:pStyle w:val="18"/>
+        <w:pStyle w:val="19"/>
         <w:numPr>
           <w:ilvl w:val="0"/>
           <w:numId w:val="1"/>
@@ -11130,7 +11247,7 @@
     </w:p>
     <w:p>
       <w:pPr>
-        <w:pStyle w:val="18"/>
+        <w:pStyle w:val="19"/>
         <w:numPr>
           <w:ilvl w:val="0"/>
           <w:numId w:val="1"/>
@@ -11192,7 +11309,7 @@
     </w:p>
     <w:p>
       <w:pPr>
-        <w:pStyle w:val="18"/>
+        <w:pStyle w:val="19"/>
         <w:numPr>
           <w:ilvl w:val="0"/>
           <w:numId w:val="1"/>
@@ -11210,7 +11327,7 @@
           <w:bCs/>
           <w:color w:val="auto"/>
         </w:rPr>
-        <w:t xml:space="preserve">Giới hạn của Groq gói miễn phí</w:t>
+        <w:t>Giới hạn của Groq gói miễn phí</w:t>
       </w:r>
       <w:r>
         <w:rPr>
@@ -11222,7 +11339,7 @@
     </w:p>
     <w:p>
       <w:pPr>
-        <w:pStyle w:val="18"/>
+        <w:pStyle w:val="19"/>
         <w:numPr>
           <w:ilvl w:val="0"/>
           <w:numId w:val="1"/>
@@ -11600,42 +11717,80 @@
                 <w:sz w:val="20"/>
                 <w:szCs w:val="20"/>
               </w:rPr>
-              <w:t>Chuẩn bị dữ liệu, chunking, hybrid/dense search, testset, eval (từ chối đúng/nhầm, faithfulness, CSV), README, Makefile, make.cmd, run.bat. Lần bổ sung bản 2024: thêm dữ liệu DOC0008, chỉ số đúng phiên bản, testset 21 câu, đổi mốc xếp loại trong mcp_server.py và thêm quy tắc phiên bản trong prompts.txt</w:t>
-            </w:r>
-          </w:p>
-        </w:tc>
-        <w:tc>
-          <w:tcPr>
-            <w:tcW w:w="2938" w:type="dxa"/>
-            <w:tcBorders>
-              <w:top w:val="single" w:color="8C8C8C" w:sz="4" w:space="0"/>
-              <w:left w:val="single" w:color="8C8C8C" w:sz="4" w:space="0"/>
-              <w:bottom w:val="single" w:color="8C8C8C" w:sz="4" w:space="0"/>
-              <w:right w:val="single" w:color="8C8C8C" w:sz="4" w:space="0"/>
-            </w:tcBorders>
-            <w:tcMar>
-              <w:top w:w="50" w:type="dxa"/>
-              <w:left w:w="90" w:type="dxa"/>
-              <w:bottom w:w="50" w:type="dxa"/>
-              <w:right w:w="90" w:type="dxa"/>
-            </w:tcMar>
-          </w:tcPr>
-          <w:p>
-            <w:pPr>
-              <w:spacing w:after="0" w:line="252" w:lineRule="auto"/>
-              <w:jc w:val="left"/>
-              <w:rPr>
-                <w:color w:val="auto"/>
-              </w:rPr>
-            </w:pPr>
-            <w:r>
-              <w:rPr>
-                <w:rFonts w:ascii="Times New Roman" w:hAnsi="Times New Roman" w:eastAsia="Times New Roman" w:cs="Times New Roman"/>
+              <w:t>Chuẩn bị dữ liệu, chunking, hybrid/dense search, testset, eval (từ chối đúng/nhầm, faithfulness, CSV),</w:t>
+            </w:r>
+            <w:r>
+              <w:rPr>
+                <w:rFonts w:hint="default" w:cs="Times New Roman"/>
                 <w:color w:val="auto"/>
                 <w:sz w:val="20"/>
                 <w:szCs w:val="20"/>
-              </w:rPr>
-              <w:t>data/*, src/rag/*, tests/eval.py, tests/testset.jsonl, tests/prompts/, demo.py, Makefile, make.cmd, run.bat, README.md</w:t>
+                <w:lang w:val="en-US"/>
+              </w:rPr>
+              <w:t xml:space="preserve"> </w:t>
+            </w:r>
+            <w:r>
+              <w:rPr>
+                <w:rFonts w:ascii="Times New Roman" w:hAnsi="Times New Roman" w:eastAsia="Times New Roman" w:cs="Times New Roman"/>
+                <w:color w:val="auto"/>
+                <w:sz w:val="20"/>
+                <w:szCs w:val="20"/>
+              </w:rPr>
+              <w:t>Lần bổ sung bản 2024: thêm dữ liệu DOC0008, chỉ số đúng phiên bản, testset 21 câu</w:t>
+            </w:r>
+            <w:r>
+              <w:rPr>
+                <w:rFonts w:hint="default" w:cs="Times New Roman"/>
+                <w:color w:val="auto"/>
+                <w:sz w:val="20"/>
+                <w:szCs w:val="20"/>
+                <w:lang w:val="en-US"/>
+              </w:rPr>
+              <w:t xml:space="preserve"> </w:t>
+            </w:r>
+            <w:r>
+              <w:rPr>
+                <w:rFonts w:ascii="Times New Roman" w:hAnsi="Times New Roman" w:eastAsia="Times New Roman" w:cs="Times New Roman"/>
+                <w:color w:val="auto"/>
+                <w:sz w:val="20"/>
+                <w:szCs w:val="20"/>
+              </w:rPr>
+              <w:t>và thêm quy tắc phiên bản trong prompts.txt</w:t>
+            </w:r>
+          </w:p>
+        </w:tc>
+        <w:tc>
+          <w:tcPr>
+            <w:tcW w:w="2938" w:type="dxa"/>
+            <w:tcBorders>
+              <w:top w:val="single" w:color="8C8C8C" w:sz="4" w:space="0"/>
+              <w:left w:val="single" w:color="8C8C8C" w:sz="4" w:space="0"/>
+              <w:bottom w:val="single" w:color="8C8C8C" w:sz="4" w:space="0"/>
+              <w:right w:val="single" w:color="8C8C8C" w:sz="4" w:space="0"/>
+            </w:tcBorders>
+            <w:tcMar>
+              <w:top w:w="50" w:type="dxa"/>
+              <w:left w:w="90" w:type="dxa"/>
+              <w:bottom w:w="50" w:type="dxa"/>
+              <w:right w:w="90" w:type="dxa"/>
+            </w:tcMar>
+          </w:tcPr>
+          <w:p>
+            <w:pPr>
+              <w:spacing w:after="0" w:line="252" w:lineRule="auto"/>
+              <w:jc w:val="left"/>
+              <w:rPr>
+                <w:color w:val="auto"/>
+              </w:rPr>
+            </w:pPr>
+            <w:r>
+              <w:rPr>
+                <w:rFonts w:ascii="Times New Roman" w:hAnsi="Times New Roman" w:eastAsia="Times New Roman" w:cs="Times New Roman"/>
+                <w:color w:val="auto"/>
+                <w:sz w:val="20"/>
+                <w:szCs w:val="20"/>
+              </w:rPr>
+              <w:t>data/*, src/rag/*, tests/eval.py, tests/testset.jsonl, tests/prompts/, demo.py</w:t>
             </w:r>
           </w:p>
         </w:tc>
@@ -11795,7 +11950,9 @@
               <w:spacing w:after="0" w:line="252" w:lineRule="auto"/>
               <w:jc w:val="left"/>
               <w:rPr>
-                <w:color w:val="auto"/>
+                <w:rFonts w:hint="default"/>
+                <w:color w:val="auto"/>
+                <w:lang w:val="en-US"/>
               </w:rPr>
             </w:pPr>
             <w:r>
@@ -11806,6 +11963,25 @@
                 <w:szCs w:val="20"/>
               </w:rPr>
               <w:t>MCP server qua stdio, 5 tool, tính điểm bằng code, lưu khiếu nại JSONL</w:t>
+            </w:r>
+            <w:r>
+              <w:rPr>
+                <w:rFonts w:hint="default" w:cs="Times New Roman"/>
+                <w:color w:val="auto"/>
+                <w:sz w:val="20"/>
+                <w:szCs w:val="20"/>
+                <w:lang w:val="en-US"/>
+              </w:rPr>
+              <w:t xml:space="preserve">, </w:t>
+            </w:r>
+            <w:r>
+              <w:rPr>
+                <w:rFonts w:ascii="Times New Roman" w:hAnsi="Times New Roman" w:eastAsia="Times New Roman" w:cs="Times New Roman"/>
+                <w:color w:val="auto"/>
+                <w:sz w:val="20"/>
+                <w:szCs w:val="20"/>
+              </w:rPr>
+              <w:t>đổi mốc xếp loại trong mcp_server.py</w:t>
             </w:r>
           </w:p>
         </w:tc>
@@ -11967,8 +12143,6 @@
               </w:rPr>
               <w:t>Trí Dũng</w:t>
             </w:r>
-            <w:bookmarkStart w:id="0" w:name="_GoBack"/>
-            <w:bookmarkEnd w:id="0"/>
           </w:p>
         </w:tc>
         <w:tc>
@@ -13114,7 +13288,22 @@
           <w:rFonts w:ascii="Times New Roman" w:hAnsi="Times New Roman" w:eastAsia="Times New Roman" w:cs="Times New Roman"/>
           <w:color w:val="auto"/>
         </w:rPr>
-        <w:t>B. Trace dài: kết quả python -m tests.eval hybrid (lần ③, 18/10/2026, rút gọn)</w:t>
+        <w:t xml:space="preserve">B. Trace dài: kết quả python -m tests.eval hybrid (lần </w:t>
+      </w:r>
+      <w:r>
+        <w:rPr>
+          <w:rFonts w:hint="default" w:cs="Times New Roman"/>
+          <w:color w:val="auto"/>
+          <w:lang w:val="en-US"/>
+        </w:rPr>
+        <w:t>3</w:t>
+      </w:r>
+      <w:r>
+        <w:rPr>
+          <w:rFonts w:ascii="Times New Roman" w:hAnsi="Times New Roman" w:eastAsia="Times New Roman" w:cs="Times New Roman"/>
+          <w:color w:val="auto"/>
+        </w:rPr>
+        <w:t>, 18/10/2026, rút gọn)</w:t>
       </w:r>
     </w:p>
     <w:p>
@@ -13652,9 +13841,6 @@
             <w:right w:w="10" w:type="dxa"/>
           </w:tblCellMar>
         </w:tblPrEx>
-        <w:trPr>
-          <w:tblHeader/>
-        </w:trPr>
         <w:tc>
           <w:tcPr>
             <w:tcW w:w="900" w:type="dxa"/>
@@ -13664,13 +13850,13 @@
               <w:bottom w:val="single" w:color="8C8C8C" w:sz="4" w:space="0"/>
               <w:right w:val="single" w:color="8C8C8C" w:sz="4" w:space="0"/>
             </w:tcBorders>
-            <w:shd w:val="clear" w:color="auto" w:fill="D9E2F3"/>
-            <w:tcMar>
-              <w:top w:w="50" w:type="dxa"/>
-              <w:left w:w="90" w:type="dxa"/>
-              <w:bottom w:w="50" w:type="dxa"/>
-              <w:right w:w="90" w:type="dxa"/>
-            </w:tcMar>
+            <w:tcMar>
+              <w:top w:w="50" w:type="dxa"/>
+              <w:left w:w="90" w:type="dxa"/>
+              <w:bottom w:w="50" w:type="dxa"/>
+              <w:right w:w="90" w:type="dxa"/>
+            </w:tcMar>
+            <w:vAlign w:val="top"/>
           </w:tcPr>
           <w:p>
             <w:pPr>
@@ -13702,13 +13888,13 @@
               <w:bottom w:val="single" w:color="8C8C8C" w:sz="4" w:space="0"/>
               <w:right w:val="single" w:color="8C8C8C" w:sz="4" w:space="0"/>
             </w:tcBorders>
-            <w:shd w:val="clear" w:color="auto" w:fill="D9E2F3"/>
-            <w:tcMar>
-              <w:top w:w="50" w:type="dxa"/>
-              <w:left w:w="90" w:type="dxa"/>
-              <w:bottom w:w="50" w:type="dxa"/>
-              <w:right w:w="90" w:type="dxa"/>
-            </w:tcMar>
+            <w:tcMar>
+              <w:top w:w="50" w:type="dxa"/>
+              <w:left w:w="90" w:type="dxa"/>
+              <w:bottom w:w="50" w:type="dxa"/>
+              <w:right w:w="90" w:type="dxa"/>
+            </w:tcMar>
+            <w:vAlign w:val="top"/>
           </w:tcPr>
           <w:p>
             <w:pPr>
@@ -13740,13 +13926,13 @@
               <w:bottom w:val="single" w:color="8C8C8C" w:sz="4" w:space="0"/>
               <w:right w:val="single" w:color="8C8C8C" w:sz="4" w:space="0"/>
             </w:tcBorders>
-            <w:shd w:val="clear" w:color="auto" w:fill="D9E2F3"/>
-            <w:tcMar>
-              <w:top w:w="50" w:type="dxa"/>
-              <w:left w:w="90" w:type="dxa"/>
-              <w:bottom w:w="50" w:type="dxa"/>
-              <w:right w:w="90" w:type="dxa"/>
-            </w:tcMar>
+            <w:tcMar>
+              <w:top w:w="50" w:type="dxa"/>
+              <w:left w:w="90" w:type="dxa"/>
+              <w:bottom w:w="50" w:type="dxa"/>
+              <w:right w:w="90" w:type="dxa"/>
+            </w:tcMar>
+            <w:vAlign w:val="top"/>
           </w:tcPr>
           <w:p>
             <w:pPr>
@@ -13778,13 +13964,13 @@
               <w:bottom w:val="single" w:color="8C8C8C" w:sz="4" w:space="0"/>
               <w:right w:val="single" w:color="8C8C8C" w:sz="4" w:space="0"/>
             </w:tcBorders>
-            <w:shd w:val="clear" w:color="auto" w:fill="D9E2F3"/>
-            <w:tcMar>
-              <w:top w:w="50" w:type="dxa"/>
-              <w:left w:w="90" w:type="dxa"/>
-              <w:bottom w:w="50" w:type="dxa"/>
-              <w:right w:w="90" w:type="dxa"/>
-            </w:tcMar>
+            <w:tcMar>
+              <w:top w:w="50" w:type="dxa"/>
+              <w:left w:w="90" w:type="dxa"/>
+              <w:bottom w:w="50" w:type="dxa"/>
+              <w:right w:w="90" w:type="dxa"/>
+            </w:tcMar>
+            <w:vAlign w:val="top"/>
           </w:tcPr>
           <w:p>
             <w:pPr>
@@ -13963,6 +14149,140 @@
               </w:rPr>
               <w:t>Sửa 3 hàm duyệt dict; tách Phụ lục, split_long_chunk, load_all_documents; tham số mode (dense); judge_faithfulness, đếm từ chối nhầm, CSV; thêm 3 câu testset; Makefile chạy được trên Windows, make.cmd, run.bat; bản 2024: dòng DOC0008, chỉ số đúng phiên bản, đưa tiêu đề cho giám khảo, sửa 5 câu và thêm 6 câu testset</w:t>
             </w:r>
+          </w:p>
+        </w:tc>
+      </w:tr>
+      <w:tr>
+        <w:tblPrEx>
+          <w:tblBorders>
+            <w:top w:val="single" w:color="auto" w:sz="4" w:space="0"/>
+            <w:left w:val="single" w:color="auto" w:sz="4" w:space="0"/>
+            <w:bottom w:val="single" w:color="auto" w:sz="4" w:space="0"/>
+            <w:right w:val="single" w:color="auto" w:sz="4" w:space="0"/>
+            <w:insideH w:val="single" w:color="auto" w:sz="4" w:space="0"/>
+            <w:insideV w:val="single" w:color="auto" w:sz="4" w:space="0"/>
+          </w:tblBorders>
+          <w:tblCellMar>
+            <w:top w:w="0" w:type="dxa"/>
+            <w:left w:w="10" w:type="dxa"/>
+            <w:bottom w:w="0" w:type="dxa"/>
+            <w:right w:w="10" w:type="dxa"/>
+          </w:tblCellMar>
+        </w:tblPrEx>
+        <w:tc>
+          <w:tcPr>
+            <w:tcW w:w="900" w:type="dxa"/>
+            <w:tcBorders>
+              <w:top w:val="single" w:color="8C8C8C" w:sz="4" w:space="0"/>
+              <w:left w:val="single" w:color="8C8C8C" w:sz="4" w:space="0"/>
+              <w:bottom w:val="single" w:color="8C8C8C" w:sz="4" w:space="0"/>
+              <w:right w:val="single" w:color="8C8C8C" w:sz="4" w:space="0"/>
+            </w:tcBorders>
+            <w:tcMar>
+              <w:top w:w="50" w:type="dxa"/>
+              <w:left w:w="90" w:type="dxa"/>
+              <w:bottom w:w="50" w:type="dxa"/>
+              <w:right w:w="90" w:type="dxa"/>
+            </w:tcMar>
+          </w:tcPr>
+          <w:p>
+            <w:pPr>
+              <w:spacing w:after="0" w:line="252" w:lineRule="auto"/>
+              <w:jc w:val="left"/>
+              <w:rPr>
+                <w:rFonts w:ascii="Times New Roman" w:hAnsi="Times New Roman" w:eastAsia="Times New Roman" w:cs="Times New Roman"/>
+                <w:color w:val="auto"/>
+                <w:sz w:val="19"/>
+                <w:szCs w:val="19"/>
+              </w:rPr>
+            </w:pPr>
+          </w:p>
+        </w:tc>
+        <w:tc>
+          <w:tcPr>
+            <w:tcW w:w="1600" w:type="dxa"/>
+            <w:tcBorders>
+              <w:top w:val="single" w:color="8C8C8C" w:sz="4" w:space="0"/>
+              <w:left w:val="single" w:color="8C8C8C" w:sz="4" w:space="0"/>
+              <w:bottom w:val="single" w:color="8C8C8C" w:sz="4" w:space="0"/>
+              <w:right w:val="single" w:color="8C8C8C" w:sz="4" w:space="0"/>
+            </w:tcBorders>
+            <w:tcMar>
+              <w:top w:w="50" w:type="dxa"/>
+              <w:left w:w="90" w:type="dxa"/>
+              <w:bottom w:w="50" w:type="dxa"/>
+              <w:right w:w="90" w:type="dxa"/>
+            </w:tcMar>
+          </w:tcPr>
+          <w:p>
+            <w:pPr>
+              <w:spacing w:after="0" w:line="252" w:lineRule="auto"/>
+              <w:jc w:val="left"/>
+              <w:rPr>
+                <w:rFonts w:ascii="Times New Roman" w:hAnsi="Times New Roman" w:eastAsia="Times New Roman" w:cs="Times New Roman"/>
+                <w:color w:val="auto"/>
+                <w:sz w:val="19"/>
+                <w:szCs w:val="19"/>
+              </w:rPr>
+            </w:pPr>
+          </w:p>
+        </w:tc>
+        <w:tc>
+          <w:tcPr>
+            <w:tcW w:w="3200" w:type="dxa"/>
+            <w:tcBorders>
+              <w:top w:val="single" w:color="8C8C8C" w:sz="4" w:space="0"/>
+              <w:left w:val="single" w:color="8C8C8C" w:sz="4" w:space="0"/>
+              <w:bottom w:val="single" w:color="8C8C8C" w:sz="4" w:space="0"/>
+              <w:right w:val="single" w:color="8C8C8C" w:sz="4" w:space="0"/>
+            </w:tcBorders>
+            <w:tcMar>
+              <w:top w:w="50" w:type="dxa"/>
+              <w:left w:w="90" w:type="dxa"/>
+              <w:bottom w:w="50" w:type="dxa"/>
+              <w:right w:w="90" w:type="dxa"/>
+            </w:tcMar>
+          </w:tcPr>
+          <w:p>
+            <w:pPr>
+              <w:spacing w:after="0" w:line="252" w:lineRule="auto"/>
+              <w:jc w:val="left"/>
+              <w:rPr>
+                <w:rFonts w:ascii="Times New Roman" w:hAnsi="Times New Roman" w:eastAsia="Times New Roman" w:cs="Times New Roman"/>
+                <w:color w:val="auto"/>
+                <w:sz w:val="19"/>
+                <w:szCs w:val="19"/>
+              </w:rPr>
+            </w:pPr>
+          </w:p>
+        </w:tc>
+        <w:tc>
+          <w:tcPr>
+            <w:tcW w:w="3938" w:type="dxa"/>
+            <w:tcBorders>
+              <w:top w:val="single" w:color="8C8C8C" w:sz="4" w:space="0"/>
+              <w:left w:val="single" w:color="8C8C8C" w:sz="4" w:space="0"/>
+              <w:bottom w:val="single" w:color="8C8C8C" w:sz="4" w:space="0"/>
+              <w:right w:val="single" w:color="8C8C8C" w:sz="4" w:space="0"/>
+            </w:tcBorders>
+            <w:tcMar>
+              <w:top w:w="50" w:type="dxa"/>
+              <w:left w:w="90" w:type="dxa"/>
+              <w:bottom w:w="50" w:type="dxa"/>
+              <w:right w:w="90" w:type="dxa"/>
+            </w:tcMar>
+          </w:tcPr>
+          <w:p>
+            <w:pPr>
+              <w:spacing w:after="0" w:line="252" w:lineRule="auto"/>
+              <w:jc w:val="left"/>
+              <w:rPr>
+                <w:rFonts w:ascii="Times New Roman" w:hAnsi="Times New Roman" w:eastAsia="Times New Roman" w:cs="Times New Roman"/>
+                <w:color w:val="auto"/>
+                <w:sz w:val="19"/>
+                <w:szCs w:val="19"/>
+              </w:rPr>
+            </w:pPr>
           </w:p>
         </w:tc>
       </w:tr>
@@ -14402,9 +14722,6 @@
             <w:right w:w="10" w:type="dxa"/>
           </w:tblCellMar>
         </w:tblPrEx>
-        <w:trPr>
-          <w:tblHeader/>
-        </w:trPr>
         <w:tc>
           <w:tcPr>
             <w:tcW w:w="600" w:type="dxa"/>
@@ -14414,13 +14731,13 @@
               <w:bottom w:val="single" w:color="8C8C8C" w:sz="4" w:space="0"/>
               <w:right w:val="single" w:color="8C8C8C" w:sz="4" w:space="0"/>
             </w:tcBorders>
-            <w:shd w:val="clear" w:color="auto" w:fill="D9E2F3"/>
-            <w:tcMar>
-              <w:top w:w="50" w:type="dxa"/>
-              <w:left w:w="90" w:type="dxa"/>
-              <w:bottom w:w="50" w:type="dxa"/>
-              <w:right w:w="90" w:type="dxa"/>
-            </w:tcMar>
+            <w:tcMar>
+              <w:top w:w="50" w:type="dxa"/>
+              <w:left w:w="90" w:type="dxa"/>
+              <w:bottom w:w="50" w:type="dxa"/>
+              <w:right w:w="90" w:type="dxa"/>
+            </w:tcMar>
+            <w:vAlign w:val="top"/>
           </w:tcPr>
           <w:p>
             <w:pPr>
@@ -14452,13 +14769,13 @@
               <w:bottom w:val="single" w:color="8C8C8C" w:sz="4" w:space="0"/>
               <w:right w:val="single" w:color="8C8C8C" w:sz="4" w:space="0"/>
             </w:tcBorders>
-            <w:shd w:val="clear" w:color="auto" w:fill="D9E2F3"/>
-            <w:tcMar>
-              <w:top w:w="50" w:type="dxa"/>
-              <w:left w:w="90" w:type="dxa"/>
-              <w:bottom w:w="50" w:type="dxa"/>
-              <w:right w:w="90" w:type="dxa"/>
-            </w:tcMar>
+            <w:tcMar>
+              <w:top w:w="50" w:type="dxa"/>
+              <w:left w:w="90" w:type="dxa"/>
+              <w:bottom w:w="50" w:type="dxa"/>
+              <w:right w:w="90" w:type="dxa"/>
+            </w:tcMar>
+            <w:vAlign w:val="top"/>
           </w:tcPr>
           <w:p>
             <w:pPr>
@@ -14490,13 +14807,13 @@
               <w:bottom w:val="single" w:color="8C8C8C" w:sz="4" w:space="0"/>
               <w:right w:val="single" w:color="8C8C8C" w:sz="4" w:space="0"/>
             </w:tcBorders>
-            <w:shd w:val="clear" w:color="auto" w:fill="D9E2F3"/>
-            <w:tcMar>
-              <w:top w:w="50" w:type="dxa"/>
-              <w:left w:w="90" w:type="dxa"/>
-              <w:bottom w:w="50" w:type="dxa"/>
-              <w:right w:w="90" w:type="dxa"/>
-            </w:tcMar>
+            <w:tcMar>
+              <w:top w:w="50" w:type="dxa"/>
+              <w:left w:w="90" w:type="dxa"/>
+              <w:bottom w:w="50" w:type="dxa"/>
+              <w:right w:w="90" w:type="dxa"/>
+            </w:tcMar>
+            <w:vAlign w:val="top"/>
           </w:tcPr>
           <w:p>
             <w:pPr>
@@ -14528,13 +14845,13 @@
               <w:bottom w:val="single" w:color="8C8C8C" w:sz="4" w:space="0"/>
               <w:right w:val="single" w:color="8C8C8C" w:sz="4" w:space="0"/>
             </w:tcBorders>
-            <w:shd w:val="clear" w:color="auto" w:fill="D9E2F3"/>
-            <w:tcMar>
-              <w:top w:w="50" w:type="dxa"/>
-              <w:left w:w="90" w:type="dxa"/>
-              <w:bottom w:w="50" w:type="dxa"/>
-              <w:right w:w="90" w:type="dxa"/>
-            </w:tcMar>
+            <w:tcMar>
+              <w:top w:w="50" w:type="dxa"/>
+              <w:left w:w="90" w:type="dxa"/>
+              <w:bottom w:w="50" w:type="dxa"/>
+              <w:right w:w="90" w:type="dxa"/>
+            </w:tcMar>
+            <w:vAlign w:val="top"/>
           </w:tcPr>
           <w:p>
             <w:pPr>
@@ -14566,13 +14883,13 @@
               <w:bottom w:val="single" w:color="8C8C8C" w:sz="4" w:space="0"/>
               <w:right w:val="single" w:color="8C8C8C" w:sz="4" w:space="0"/>
             </w:tcBorders>
-            <w:shd w:val="clear" w:color="auto" w:fill="D9E2F3"/>
-            <w:tcMar>
-              <w:top w:w="50" w:type="dxa"/>
-              <w:left w:w="90" w:type="dxa"/>
-              <w:bottom w:w="50" w:type="dxa"/>
-              <w:right w:w="90" w:type="dxa"/>
-            </w:tcMar>
+            <w:tcMar>
+              <w:top w:w="50" w:type="dxa"/>
+              <w:left w:w="90" w:type="dxa"/>
+              <w:bottom w:w="50" w:type="dxa"/>
+              <w:right w:w="90" w:type="dxa"/>
+            </w:tcMar>
+            <w:vAlign w:val="top"/>
           </w:tcPr>
           <w:p>
             <w:pPr>
@@ -14604,13 +14921,13 @@
               <w:bottom w:val="single" w:color="8C8C8C" w:sz="4" w:space="0"/>
               <w:right w:val="single" w:color="8C8C8C" w:sz="4" w:space="0"/>
             </w:tcBorders>
-            <w:shd w:val="clear" w:color="auto" w:fill="D9E2F3"/>
-            <w:tcMar>
-              <w:top w:w="50" w:type="dxa"/>
-              <w:left w:w="90" w:type="dxa"/>
-              <w:bottom w:w="50" w:type="dxa"/>
-              <w:right w:w="90" w:type="dxa"/>
-            </w:tcMar>
+            <w:tcMar>
+              <w:top w:w="50" w:type="dxa"/>
+              <w:left w:w="90" w:type="dxa"/>
+              <w:bottom w:w="50" w:type="dxa"/>
+              <w:right w:w="90" w:type="dxa"/>
+            </w:tcMar>
+            <w:vAlign w:val="top"/>
           </w:tcPr>
           <w:p>
             <w:pPr>
@@ -14642,13 +14959,13 @@
               <w:bottom w:val="single" w:color="8C8C8C" w:sz="4" w:space="0"/>
               <w:right w:val="single" w:color="8C8C8C" w:sz="4" w:space="0"/>
             </w:tcBorders>
-            <w:shd w:val="clear" w:color="auto" w:fill="D9E2F3"/>
-            <w:tcMar>
-              <w:top w:w="50" w:type="dxa"/>
-              <w:left w:w="90" w:type="dxa"/>
-              <w:bottom w:w="50" w:type="dxa"/>
-              <w:right w:w="90" w:type="dxa"/>
-            </w:tcMar>
+            <w:tcMar>
+              <w:top w:w="50" w:type="dxa"/>
+              <w:left w:w="90" w:type="dxa"/>
+              <w:bottom w:w="50" w:type="dxa"/>
+              <w:right w:w="90" w:type="dxa"/>
+            </w:tcMar>
+            <w:vAlign w:val="top"/>
           </w:tcPr>
           <w:p>
             <w:pPr>
@@ -14680,13 +14997,13 @@
               <w:bottom w:val="single" w:color="8C8C8C" w:sz="4" w:space="0"/>
               <w:right w:val="single" w:color="8C8C8C" w:sz="4" w:space="0"/>
             </w:tcBorders>
-            <w:shd w:val="clear" w:color="auto" w:fill="D9E2F3"/>
-            <w:tcMar>
-              <w:top w:w="50" w:type="dxa"/>
-              <w:left w:w="90" w:type="dxa"/>
-              <w:bottom w:w="50" w:type="dxa"/>
-              <w:right w:w="90" w:type="dxa"/>
-            </w:tcMar>
+            <w:tcMar>
+              <w:top w:w="50" w:type="dxa"/>
+              <w:left w:w="90" w:type="dxa"/>
+              <w:bottom w:w="50" w:type="dxa"/>
+              <w:right w:w="90" w:type="dxa"/>
+            </w:tcMar>
+            <w:vAlign w:val="top"/>
           </w:tcPr>
           <w:p>
             <w:pPr>
@@ -21258,10 +21575,11 @@
         </w:tc>
       </w:tr>
     </w:tbl>
+    <w:p/>
     <w:sectPr>
       <w:footerReference r:id="rId3" w:type="default"/>
       <w:pgSz w:w="11906" w:h="16838"/>
-      <w:pgMar w:top="1134" w:right="1134" w:bottom="1134" w:left="1134" w:header="708" w:footer="708" w:gutter="0"/>
+      <w:pgMar w:top="1138" w:right="1138" w:bottom="1138" w:left="1138" w:header="708" w:footer="708" w:gutter="0"/>
       <w:pgBorders w:display="firstPage">
         <w:top w:val="twistedLines1" w:color="auto" w:sz="31" w:space="1"/>
         <w:left w:val="twistedLines1" w:color="auto" w:sz="31" w:space="4"/>
@@ -21443,7 +21761,7 @@
     <w:lsdException w:unhideWhenUsed="0" w:uiPriority="0" w:semiHidden="0" w:name="HTML Acronym"/>
     <w:lsdException w:unhideWhenUsed="0" w:uiPriority="0" w:semiHidden="0" w:name="HTML Address"/>
     <w:lsdException w:unhideWhenUsed="0" w:uiPriority="0" w:semiHidden="0" w:name="HTML Cite"/>
-    <w:lsdException w:unhideWhenUsed="0" w:uiPriority="0" w:semiHidden="0" w:name="HTML Code"/>
+    <w:lsdException w:qFormat="1" w:unhideWhenUsed="0" w:uiPriority="0" w:semiHidden="0" w:name="HTML Code"/>
     <w:lsdException w:unhideWhenUsed="0" w:uiPriority="0" w:semiHidden="0" w:name="HTML Definition"/>
     <w:lsdException w:unhideWhenUsed="0" w:uiPriority="0" w:semiHidden="0" w:name="HTML Keyboard"/>
     <w:lsdException w:unhideWhenUsed="0" w:uiPriority="0" w:semiHidden="0" w:name="HTML Preformatted"/>
@@ -21726,7 +22044,7 @@
   </w:style>
   <w:style w:type="paragraph" w:styleId="11">
     <w:name w:val="endnote text"/>
-    <w:link w:val="20"/>
+    <w:link w:val="21"/>
     <w:semiHidden/>
     <w:unhideWhenUsed/>
     <w:qFormat/>
@@ -21752,7 +22070,7 @@
   </w:style>
   <w:style w:type="paragraph" w:styleId="13">
     <w:name w:val="footnote text"/>
-    <w:link w:val="19"/>
+    <w:link w:val="20"/>
     <w:semiHidden/>
     <w:unhideWhenUsed/>
     <w:qFormat/>
@@ -21786,6 +22104,7 @@
   <w:style w:type="character" w:styleId="15">
     <w:name w:val="HTML Code"/>
     <w:basedOn w:val="8"/>
+    <w:qFormat/>
     <w:uiPriority w:val="0"/>
     <w:rPr>
       <w:rFonts w:ascii="Courier New" w:hAnsi="Courier New" w:cs="Courier New"/>
@@ -21803,7 +22122,26 @@
       <w:u w:val="single"/>
     </w:rPr>
   </w:style>
-  <w:style w:type="paragraph" w:styleId="17">
+  <w:style w:type="table" w:styleId="17">
+    <w:name w:val="Table Grid"/>
+    <w:basedOn w:val="9"/>
+    <w:uiPriority w:val="0"/>
+    <w:pPr>
+      <w:widowControl w:val="0"/>
+      <w:jc w:val="both"/>
+    </w:pPr>
+    <w:tblPr>
+      <w:tblBorders>
+        <w:top w:val="single" w:color="auto" w:sz="4" w:space="0"/>
+        <w:left w:val="single" w:color="auto" w:sz="4" w:space="0"/>
+        <w:bottom w:val="single" w:color="auto" w:sz="4" w:space="0"/>
+        <w:right w:val="single" w:color="auto" w:sz="4" w:space="0"/>
+        <w:insideH w:val="single" w:color="auto" w:sz="4" w:space="0"/>
+        <w:insideV w:val="single" w:color="auto" w:sz="4" w:space="0"/>
+      </w:tblBorders>
+    </w:tblPr>
+  </w:style>
+  <w:style w:type="paragraph" w:styleId="18">
     <w:name w:val="Title"/>
     <w:qFormat/>
     <w:uiPriority w:val="0"/>
@@ -21813,7 +22151,7 @@
       <w:szCs w:val="56"/>
     </w:rPr>
   </w:style>
-  <w:style w:type="paragraph" w:styleId="18">
+  <w:style w:type="paragraph" w:styleId="19">
     <w:name w:val="List Paragraph"/>
     <w:qFormat/>
     <w:uiPriority w:val="0"/>
@@ -21823,7 +22161,7 @@
       <w:szCs w:val="24"/>
     </w:rPr>
   </w:style>
-  <w:style w:type="character" w:customStyle="1" w:styleId="19">
+  <w:style w:type="character" w:customStyle="1" w:styleId="20">
     <w:name w:val="Footnote Text Char"/>
     <w:link w:val="13"/>
     <w:semiHidden/>
@@ -21835,7 +22173,7 @@
       <w:szCs w:val="20"/>
     </w:rPr>
   </w:style>
-  <w:style w:type="character" w:customStyle="1" w:styleId="20">
+  <w:style w:type="character" w:customStyle="1" w:styleId="21">
     <w:name w:val="Endnote Text Char"/>
     <w:link w:val="11"/>
     <w:semiHidden/>

</xml_diff>